<commit_message>
Update YSystem contracts and add evaluation reports
</commit_message>
<xml_diff>
--- a/契約書/QRPayment/YSystem/YSystem_SoftwareDevelopment_QRPaymentFeature.docx
+++ b/契約書/QRPayment/YSystem/YSystem_SoftwareDevelopment_QRPaymentFeature.docx
@@ -233,13 +233,17 @@
           <w14:ligatures w14:val="none"/>
         </w:rPr>
         <w:lastRenderedPageBreak/>
-        <w:t xml:space="preserve">This Software Development Agreement (the “Agreement” or “Software Development Agreement”) states the terms and conditions that govern the contractual agreement between </w:t>
-      </w:r>
-      <w:r>
-        <w:rPr>
-          <w:rFonts w:ascii="Arial" w:eastAsia="Yu Mincho Regular" w:hAnsi="Arial" w:cs="Arial"/>
-          <w:color w:val="FB0007"/>
-          <w:sz w:val="24"/>
+        <w:t xml:space="preserve">This Software Development Agreement (the "Agreement" or "Software Development Agreement") states the terms and conditions that govern the contractual agreement between </w:t>
+      </w:r>
+      <w:r>
+        <w:rPr>
+          <w:rFonts w:ascii="Arial" w:eastAsia="ＭＳ Ｐゴシック" w:hAnsi="Arial" w:cs="Arial"/>
+          <w:b/>
+          <w:bCs/>
+          <w:color w:val="FF0000"/>
+          <w:kern w:val="0"/>
+          <w:sz w:val="24"/>
+          <w14:ligatures w14:val="none"/>
         </w:rPr>
         <w:t>CURIOX SOLUTIONS LIMITED</w:t>
       </w:r>
@@ -254,27 +258,33 @@
       </w:r>
       <w:r>
         <w:rPr>
-          <w:rFonts w:ascii="Arial" w:eastAsia="Yu Mincho Regular" w:hAnsi="Arial" w:cs="Arial"/>
-          <w:color w:val="FB0007"/>
-          <w:sz w:val="24"/>
+          <w:rFonts w:ascii="Arial" w:eastAsia="ＭＳ Ｐゴシック" w:hAnsi="Arial" w:cs="Arial"/>
+          <w:color w:val="FF0000"/>
+          <w:kern w:val="0"/>
+          <w:sz w:val="24"/>
+          <w14:ligatures w14:val="none"/>
         </w:rPr>
         <w:t xml:space="preserve">Suite 2701-08 27/F., Shui On Centre, Nos. 6-8 </w:t>
       </w:r>
       <w:proofErr w:type="spellStart"/>
       <w:r>
         <w:rPr>
-          <w:rFonts w:ascii="Arial" w:eastAsia="Yu Mincho Regular" w:hAnsi="Arial" w:cs="Arial"/>
-          <w:color w:val="FB0007"/>
-          <w:sz w:val="24"/>
+          <w:rFonts w:ascii="Arial" w:eastAsia="ＭＳ Ｐゴシック" w:hAnsi="Arial" w:cs="Arial"/>
+          <w:color w:val="FF0000"/>
+          <w:kern w:val="0"/>
+          <w:sz w:val="24"/>
+          <w14:ligatures w14:val="none"/>
         </w:rPr>
         <w:t>Harbour</w:t>
       </w:r>
       <w:proofErr w:type="spellEnd"/>
       <w:r>
         <w:rPr>
-          <w:rFonts w:ascii="Arial" w:eastAsia="Yu Mincho Regular" w:hAnsi="Arial" w:cs="Arial"/>
-          <w:color w:val="FB0007"/>
-          <w:sz w:val="24"/>
+          <w:rFonts w:ascii="Arial" w:eastAsia="ＭＳ Ｐゴシック" w:hAnsi="Arial" w:cs="Arial"/>
+          <w:color w:val="FF0000"/>
+          <w:kern w:val="0"/>
+          <w:sz w:val="24"/>
+          <w14:ligatures w14:val="none"/>
         </w:rPr>
         <w:t xml:space="preserve"> Road, Wanchai, Hong Kong</w:t>
       </w:r>
@@ -285,14 +295,24 @@
           <w:sz w:val="24"/>
           <w14:ligatures w14:val="none"/>
         </w:rPr>
-        <w:t xml:space="preserve"> (the “Developer”) and </w:t>
-      </w:r>
-      <w:r>
-        <w:rPr>
-          <w:rFonts w:ascii="Arial" w:eastAsia="ＭＳ Ｐゴシック" w:hAnsi="Arial" w:cs="Arial"/>
-          <w:b/>
-          <w:bCs/>
-          <w:color w:val="EE0000"/>
+        <w:t xml:space="preserve"> (the "Developer") and</w:t>
+      </w:r>
+      <w:r>
+        <w:rPr>
+          <w:rFonts w:ascii="Arial" w:eastAsia="ＭＳ Ｐゴシック" w:hAnsi="Arial" w:cs="Arial"/>
+          <w:color w:val="FF0000"/>
+          <w:kern w:val="0"/>
+          <w:sz w:val="24"/>
+          <w14:ligatures w14:val="none"/>
+        </w:rPr>
+        <w:t xml:space="preserve"> </w:t>
+      </w:r>
+      <w:r>
+        <w:rPr>
+          <w:rFonts w:ascii="Arial" w:eastAsia="ＭＳ Ｐゴシック" w:hAnsi="Arial" w:cs="Arial"/>
+          <w:b/>
+          <w:bCs/>
+          <w:color w:val="FF0000"/>
           <w:kern w:val="0"/>
           <w:sz w:val="24"/>
           <w14:ligatures w14:val="none"/>
@@ -302,113 +322,1554 @@
       <w:r>
         <w:rPr>
           <w:rFonts w:ascii="Arial" w:eastAsia="ＭＳ Ｐゴシック" w:hAnsi="Arial" w:cs="Arial"/>
-          <w:color w:val="EE0000"/>
-          <w:kern w:val="0"/>
-          <w:sz w:val="24"/>
-          <w14:ligatures w14:val="none"/>
-        </w:rPr>
-        <w:t>,</w:t>
-      </w:r>
-      <w:r>
-        <w:rPr>
-          <w:rFonts w:ascii="Arial" w:eastAsia="ＭＳ Ｐゴシック" w:hAnsi="Arial" w:cs="Arial"/>
-          <w:kern w:val="0"/>
-          <w:sz w:val="24"/>
-          <w14:ligatures w14:val="none"/>
-        </w:rPr>
-        <w:t xml:space="preserve"> having its principal place of business at</w:t>
-      </w:r>
-      <w:r>
-        <w:rPr>
-          <w:rFonts w:ascii="Arial" w:eastAsia="ＭＳ Ｐゴシック" w:hAnsi="Arial" w:cs="Arial"/>
-          <w:color w:val="EE0000"/>
-          <w:kern w:val="0"/>
-          <w:sz w:val="24"/>
-          <w14:ligatures w14:val="none"/>
-        </w:rPr>
-        <w:t xml:space="preserve"> [Client Address]</w:t>
-      </w:r>
-      <w:r>
-        <w:rPr>
-          <w:rFonts w:ascii="Arial" w:eastAsia="ＭＳ Ｐゴシック" w:hAnsi="Arial" w:cs="Arial"/>
-          <w:kern w:val="0"/>
-          <w:sz w:val="24"/>
-          <w14:ligatures w14:val="none"/>
-        </w:rPr>
-        <w:t xml:space="preserve"> (the “Client”) who agrees to be bound by this Agreement.</w:t>
-      </w:r>
-    </w:p>
-    <w:p>
-      <w:pPr>
-        <w:widowControl/>
-        <w:spacing w:before="100" w:beforeAutospacing="1" w:after="100" w:afterAutospacing="1" w:line="240" w:lineRule="auto"/>
-        <w:rPr>
-          <w:rFonts w:ascii="Arial" w:eastAsia="ＭＳ Ｐゴシック" w:hAnsi="Arial" w:cs="Arial"/>
-          <w:kern w:val="0"/>
-          <w:sz w:val="24"/>
-          <w14:ligatures w14:val="none"/>
-        </w:rPr>
-      </w:pPr>
-      <w:r>
-        <w:rPr>
-          <w:rFonts w:ascii="Arial" w:eastAsia="ＭＳ Ｐゴシック" w:hAnsi="Arial" w:cs="Arial"/>
-          <w:kern w:val="0"/>
-          <w:sz w:val="24"/>
-          <w14:ligatures w14:val="none"/>
-        </w:rPr>
-        <w:t>WHEREAS,</w:t>
-      </w:r>
-      <w:r>
-        <w:rPr>
-          <w:rFonts w:ascii="Arial" w:eastAsia="ＭＳ Ｐゴシック" w:hAnsi="Arial" w:cs="Arial"/>
-          <w:color w:val="EE0000"/>
-          <w:kern w:val="0"/>
-          <w:sz w:val="24"/>
-          <w14:ligatures w14:val="none"/>
-        </w:rPr>
-        <w:t xml:space="preserve"> the Client has conceptualized a </w:t>
-      </w:r>
-      <w:r>
-        <w:rPr>
-          <w:rFonts w:ascii="Arial" w:eastAsia="ＭＳ Ｐゴシック" w:hAnsi="Arial" w:cs="Arial"/>
-          <w:b/>
-          <w:bCs/>
-          <w:color w:val="EE0000"/>
-          <w:kern w:val="0"/>
-          <w:sz w:val="24"/>
-          <w14:ligatures w14:val="none"/>
-        </w:rPr>
-        <w:t>QR code payment feature</w:t>
-      </w:r>
-      <w:r>
-        <w:rPr>
-          <w:rFonts w:ascii="Arial" w:eastAsia="ＭＳ Ｐゴシック" w:hAnsi="Arial" w:cs="Arial"/>
-          <w:kern w:val="0"/>
-          <w:sz w:val="24"/>
-          <w14:ligatures w14:val="none"/>
-        </w:rPr>
-        <w:t xml:space="preserve"> (the “Software”), and the Developer is a contractor with whom the Client has come to an agreement to develop the Software.</w:t>
-      </w:r>
-    </w:p>
-    <w:p>
-      <w:pPr>
-        <w:widowControl/>
-        <w:spacing w:before="100" w:beforeAutospacing="1" w:after="100" w:afterAutospacing="1" w:line="240" w:lineRule="auto"/>
-        <w:rPr>
-          <w:rFonts w:ascii="Arial" w:eastAsia="ＭＳ Ｐゴシック" w:hAnsi="Arial" w:cs="Arial"/>
-          <w:kern w:val="0"/>
-          <w:sz w:val="24"/>
-          <w14:ligatures w14:val="none"/>
-        </w:rPr>
-      </w:pPr>
-      <w:r>
-        <w:rPr>
-          <w:rFonts w:ascii="Arial" w:eastAsia="ＭＳ Ｐゴシック" w:hAnsi="Arial" w:cs="Arial"/>
-          <w:kern w:val="0"/>
-          <w:sz w:val="24"/>
-          <w14:ligatures w14:val="none"/>
-        </w:rPr>
-        <w:t>NOW, THEREFORE, in consideration of the mutual covenants and promises made by the parties to this Software Development Agreement, the Developer and the Client (individually, each a “Party” and collectively, the “Parties”) covenant and agree as follows:</w:t>
+          <w:kern w:val="0"/>
+          <w:sz w:val="24"/>
+          <w14:ligatures w14:val="none"/>
+        </w:rPr>
+        <w:t xml:space="preserve">, having its principal place of business at </w:t>
+      </w:r>
+      <w:r>
+        <w:rPr>
+          <w:rFonts w:ascii="Arial" w:eastAsia="ＭＳ Ｐゴシック" w:hAnsi="Arial" w:cs="Arial"/>
+          <w:color w:val="FF0000"/>
+          <w:kern w:val="0"/>
+          <w:sz w:val="24"/>
+          <w14:ligatures w14:val="none"/>
+        </w:rPr>
+        <w:t>[Client Address]</w:t>
+      </w:r>
+      <w:r>
+        <w:rPr>
+          <w:rFonts w:ascii="Arial" w:eastAsia="ＭＳ Ｐゴシック" w:hAnsi="Arial" w:cs="Arial"/>
+          <w:kern w:val="0"/>
+          <w:sz w:val="24"/>
+          <w14:ligatures w14:val="none"/>
+        </w:rPr>
+        <w:t xml:space="preserve"> (the "Client") who agrees to be bound by this Agreement.</w:t>
+      </w:r>
+    </w:p>
+    <w:p>
+      <w:pPr>
+        <w:widowControl/>
+        <w:spacing w:before="100" w:beforeAutospacing="1" w:after="100" w:afterAutospacing="1" w:line="240" w:lineRule="auto"/>
+        <w:rPr>
+          <w:rFonts w:ascii="Arial" w:eastAsia="ＭＳ Ｐゴシック" w:hAnsi="Arial" w:cs="Arial"/>
+          <w:kern w:val="0"/>
+          <w:sz w:val="24"/>
+          <w14:ligatures w14:val="none"/>
+        </w:rPr>
+      </w:pPr>
+      <w:r>
+        <w:rPr>
+          <w:rFonts w:ascii="Arial" w:eastAsia="ＭＳ Ｐゴシック" w:hAnsi="Arial" w:cs="Arial"/>
+          <w:b/>
+          <w:bCs/>
+          <w:kern w:val="0"/>
+          <w:sz w:val="24"/>
+          <w14:ligatures w14:val="none"/>
+        </w:rPr>
+        <w:t>WHEREAS</w:t>
+      </w:r>
+      <w:r>
+        <w:rPr>
+          <w:rFonts w:ascii="Arial" w:eastAsia="ＭＳ Ｐゴシック" w:hAnsi="Arial" w:cs="Arial"/>
+          <w:kern w:val="0"/>
+          <w:sz w:val="24"/>
+          <w14:ligatures w14:val="none"/>
+        </w:rPr>
+        <w:t>, the Client has conceptualized a QR code payment feature (the "Software"), and the Developer is a contractor with whom the Client has come to an agreement to develop the Software.</w:t>
+      </w:r>
+    </w:p>
+    <w:p>
+      <w:pPr>
+        <w:widowControl/>
+        <w:spacing w:before="100" w:beforeAutospacing="1" w:after="100" w:afterAutospacing="1" w:line="240" w:lineRule="auto"/>
+        <w:rPr>
+          <w:rFonts w:ascii="Arial" w:eastAsia="ＭＳ Ｐゴシック" w:hAnsi="Arial" w:cs="Arial"/>
+          <w:kern w:val="0"/>
+          <w:sz w:val="24"/>
+          <w14:ligatures w14:val="none"/>
+        </w:rPr>
+      </w:pPr>
+      <w:r>
+        <w:rPr>
+          <w:rFonts w:ascii="Arial" w:eastAsia="ＭＳ Ｐゴシック" w:hAnsi="Arial" w:cs="Arial"/>
+          <w:b/>
+          <w:bCs/>
+          <w:kern w:val="0"/>
+          <w:sz w:val="24"/>
+          <w14:ligatures w14:val="none"/>
+        </w:rPr>
+        <w:t>NOW, THEREFORE</w:t>
+      </w:r>
+      <w:r>
+        <w:rPr>
+          <w:rFonts w:ascii="Arial" w:eastAsia="ＭＳ Ｐゴシック" w:hAnsi="Arial" w:cs="Arial"/>
+          <w:kern w:val="0"/>
+          <w:sz w:val="24"/>
+          <w14:ligatures w14:val="none"/>
+        </w:rPr>
+        <w:t>, in consideration of the mutual covenants and promises made by the parties to this Software Development Agreement, the Developer and the Client (individually, each a "Party" and collectively, the "Parties") covenant and agree as follows:</w:t>
+      </w:r>
+    </w:p>
+    <w:p>
+      <w:pPr>
+        <w:widowControl/>
+        <w:spacing w:after="0" w:line="240" w:lineRule="auto"/>
+        <w:rPr>
+          <w:rFonts w:ascii="Arial" w:eastAsia="ＭＳ Ｐゴシック" w:hAnsi="Arial" w:cs="Arial"/>
+          <w:kern w:val="0"/>
+          <w:sz w:val="24"/>
+          <w14:ligatures w14:val="none"/>
+        </w:rPr>
+      </w:pPr>
+    </w:p>
+    <w:p>
+      <w:pPr>
+        <w:widowControl/>
+        <w:spacing w:before="100" w:beforeAutospacing="1" w:after="100" w:afterAutospacing="1" w:line="240" w:lineRule="auto"/>
+        <w:outlineLvl w:val="1"/>
+        <w:rPr>
+          <w:rFonts w:ascii="Arial" w:eastAsia="ＭＳ Ｐゴシック" w:hAnsi="Arial" w:cs="Arial"/>
+          <w:b/>
+          <w:bCs/>
+          <w:kern w:val="0"/>
+          <w:sz w:val="36"/>
+          <w:szCs w:val="36"/>
+          <w14:ligatures w14:val="none"/>
+        </w:rPr>
+      </w:pPr>
+      <w:r>
+        <w:rPr>
+          <w:rFonts w:ascii="Arial" w:eastAsia="ＭＳ Ｐゴシック" w:hAnsi="Arial" w:cs="Arial"/>
+          <w:b/>
+          <w:bCs/>
+          <w:kern w:val="0"/>
+          <w:sz w:val="36"/>
+          <w:szCs w:val="36"/>
+          <w14:ligatures w14:val="none"/>
+        </w:rPr>
+        <w:t>1. Developer's Duties</w:t>
+      </w:r>
+    </w:p>
+    <w:p>
+      <w:pPr>
+        <w:widowControl/>
+        <w:numPr>
+          <w:ilvl w:val="0"/>
+          <w:numId w:val="5"/>
+        </w:numPr>
+        <w:spacing w:before="100" w:beforeAutospacing="1" w:after="100" w:afterAutospacing="1" w:line="240" w:lineRule="auto"/>
+        <w:rPr>
+          <w:rFonts w:ascii="Arial" w:eastAsia="ＭＳ Ｐゴシック" w:hAnsi="Arial" w:cs="Arial"/>
+          <w:kern w:val="0"/>
+          <w:sz w:val="24"/>
+          <w14:ligatures w14:val="none"/>
+        </w:rPr>
+      </w:pPr>
+      <w:r>
+        <w:rPr>
+          <w:rFonts w:ascii="Arial" w:eastAsia="ＭＳ Ｐゴシック" w:hAnsi="Arial" w:cs="Arial"/>
+          <w:kern w:val="0"/>
+          <w:sz w:val="24"/>
+          <w14:ligatures w14:val="none"/>
+        </w:rPr>
+        <w:t xml:space="preserve">The Client hereby engages the </w:t>
+      </w:r>
+      <w:proofErr w:type="gramStart"/>
+      <w:r>
+        <w:rPr>
+          <w:rFonts w:ascii="Arial" w:eastAsia="ＭＳ Ｐゴシック" w:hAnsi="Arial" w:cs="Arial"/>
+          <w:kern w:val="0"/>
+          <w:sz w:val="24"/>
+          <w14:ligatures w14:val="none"/>
+        </w:rPr>
+        <w:t>Developer</w:t>
+      </w:r>
+      <w:proofErr w:type="gramEnd"/>
+      <w:r>
+        <w:rPr>
+          <w:rFonts w:ascii="Arial" w:eastAsia="ＭＳ Ｐゴシック" w:hAnsi="Arial" w:cs="Arial"/>
+          <w:kern w:val="0"/>
+          <w:sz w:val="24"/>
+          <w14:ligatures w14:val="none"/>
+        </w:rPr>
+        <w:t xml:space="preserve"> and the Developer hereby agrees to be engaged by the Client to develop the Software in accordance with the specifications.</w:t>
+      </w:r>
+    </w:p>
+    <w:p>
+      <w:pPr>
+        <w:widowControl/>
+        <w:numPr>
+          <w:ilvl w:val="0"/>
+          <w:numId w:val="5"/>
+        </w:numPr>
+        <w:spacing w:before="100" w:beforeAutospacing="1" w:after="100" w:afterAutospacing="1" w:line="240" w:lineRule="auto"/>
+        <w:rPr>
+          <w:rFonts w:ascii="Arial" w:eastAsia="ＭＳ Ｐゴシック" w:hAnsi="Arial" w:cs="Arial"/>
+          <w:kern w:val="0"/>
+          <w:sz w:val="24"/>
+          <w14:ligatures w14:val="none"/>
+        </w:rPr>
+      </w:pPr>
+      <w:r>
+        <w:rPr>
+          <w:rFonts w:ascii="Arial" w:eastAsia="ＭＳ Ｐゴシック" w:hAnsi="Arial" w:cs="Arial"/>
+          <w:kern w:val="0"/>
+          <w:sz w:val="24"/>
+          <w14:ligatures w14:val="none"/>
+        </w:rPr>
+        <w:t xml:space="preserve">The Developer shall complete the development of the Software. The final product shall be delivered to the Client by </w:t>
+      </w:r>
+      <w:r>
+        <w:rPr>
+          <w:rFonts w:ascii="Arial" w:eastAsia="ＭＳ Ｐゴシック" w:hAnsi="Arial" w:cs="Arial"/>
+          <w:b/>
+          <w:bCs/>
+          <w:color w:val="FF0000"/>
+          <w:kern w:val="0"/>
+          <w:sz w:val="24"/>
+          <w14:ligatures w14:val="none"/>
+        </w:rPr>
+        <w:t>05 December 2025</w:t>
+      </w:r>
+      <w:r>
+        <w:rPr>
+          <w:rFonts w:ascii="Arial" w:eastAsia="ＭＳ Ｐゴシック" w:hAnsi="Arial" w:cs="Arial"/>
+          <w:kern w:val="0"/>
+          <w:sz w:val="24"/>
+          <w14:ligatures w14:val="none"/>
+        </w:rPr>
+        <w:t>.</w:t>
+      </w:r>
+    </w:p>
+    <w:p>
+      <w:pPr>
+        <w:widowControl/>
+        <w:numPr>
+          <w:ilvl w:val="0"/>
+          <w:numId w:val="5"/>
+        </w:numPr>
+        <w:spacing w:before="100" w:beforeAutospacing="1" w:after="100" w:afterAutospacing="1" w:line="240" w:lineRule="auto"/>
+        <w:rPr>
+          <w:rFonts w:ascii="Arial" w:eastAsia="ＭＳ Ｐゴシック" w:hAnsi="Arial" w:cs="Arial"/>
+          <w:kern w:val="0"/>
+          <w:sz w:val="24"/>
+          <w14:ligatures w14:val="none"/>
+        </w:rPr>
+      </w:pPr>
+      <w:r>
+        <w:rPr>
+          <w:rFonts w:ascii="Arial" w:eastAsia="ＭＳ Ｐゴシック" w:hAnsi="Arial" w:cs="Arial"/>
+          <w:kern w:val="0"/>
+          <w:sz w:val="24"/>
+          <w14:ligatures w14:val="none"/>
+        </w:rPr>
+        <w:t xml:space="preserve">For a period </w:t>
+      </w:r>
+      <w:r>
+        <w:rPr>
+          <w:rFonts w:ascii="Arial" w:eastAsia="ＭＳ Ｐゴシック" w:hAnsi="Arial" w:cs="Arial"/>
+          <w:b/>
+          <w:bCs/>
+          <w:kern w:val="0"/>
+          <w:sz w:val="24"/>
+          <w14:ligatures w14:val="none"/>
+        </w:rPr>
+        <w:t>60 days</w:t>
+      </w:r>
+      <w:r>
+        <w:rPr>
+          <w:rFonts w:ascii="Arial" w:eastAsia="ＭＳ Ｐゴシック" w:hAnsi="Arial" w:cs="Arial"/>
+          <w:kern w:val="0"/>
+          <w:sz w:val="24"/>
+          <w14:ligatures w14:val="none"/>
+        </w:rPr>
+        <w:t xml:space="preserve"> after delivery of the final product, the Developer shall provide the Client assistance in answering questions or resolving issues strictly within the scope of the specification described in </w:t>
+      </w:r>
+      <w:r>
+        <w:rPr>
+          <w:rFonts w:ascii="Arial" w:eastAsia="ＭＳ Ｐゴシック" w:hAnsi="Arial" w:cs="Arial"/>
+          <w:color w:val="FF0000"/>
+          <w:kern w:val="0"/>
+          <w:sz w:val="24"/>
+          <w14:ligatures w14:val="none"/>
+        </w:rPr>
+        <w:t>Exhibit A</w:t>
+      </w:r>
+      <w:r>
+        <w:rPr>
+          <w:rFonts w:ascii="Arial" w:eastAsia="ＭＳ Ｐゴシック" w:hAnsi="Arial" w:cs="Arial"/>
+          <w:kern w:val="0"/>
+          <w:sz w:val="24"/>
+          <w14:ligatures w14:val="none"/>
+        </w:rPr>
+        <w:t xml:space="preserve">, including training regarding the operation and integration of the QR code payment feature, limited to a maximum of </w:t>
+      </w:r>
+      <w:r>
+        <w:rPr>
+          <w:rFonts w:ascii="Arial" w:eastAsia="ＭＳ Ｐゴシック" w:hAnsi="Arial" w:cs="Arial"/>
+          <w:b/>
+          <w:bCs/>
+          <w:color w:val="FF0000"/>
+          <w:kern w:val="0"/>
+          <w:sz w:val="24"/>
+          <w14:ligatures w14:val="none"/>
+        </w:rPr>
+        <w:t>10 hours total</w:t>
+      </w:r>
+      <w:r>
+        <w:rPr>
+          <w:rFonts w:ascii="Arial" w:eastAsia="ＭＳ Ｐゴシック" w:hAnsi="Arial" w:cs="Arial"/>
+          <w:kern w:val="0"/>
+          <w:sz w:val="24"/>
+          <w14:ligatures w14:val="none"/>
+        </w:rPr>
+        <w:t xml:space="preserve"> of support and training combined. Additional support or training beyond this scope shall be provided under a separate service agreement at the Developer's standard rates.</w:t>
+      </w:r>
+    </w:p>
+    <w:p>
+      <w:pPr>
+        <w:widowControl/>
+        <w:numPr>
+          <w:ilvl w:val="0"/>
+          <w:numId w:val="5"/>
+        </w:numPr>
+        <w:spacing w:before="100" w:beforeAutospacing="1" w:after="100" w:afterAutospacing="1" w:line="240" w:lineRule="auto"/>
+        <w:rPr>
+          <w:rFonts w:ascii="Arial" w:eastAsia="ＭＳ Ｐゴシック" w:hAnsi="Arial" w:cs="Arial"/>
+          <w:kern w:val="0"/>
+          <w:sz w:val="24"/>
+          <w14:ligatures w14:val="none"/>
+        </w:rPr>
+      </w:pPr>
+      <w:r>
+        <w:rPr>
+          <w:rFonts w:ascii="Arial" w:eastAsia="ＭＳ Ｐゴシック" w:hAnsi="Arial" w:cs="Arial"/>
+          <w:kern w:val="0"/>
+          <w:sz w:val="24"/>
+          <w14:ligatures w14:val="none"/>
+        </w:rPr>
+        <w:lastRenderedPageBreak/>
+        <w:t xml:space="preserve">The Client may terminate this Software Development Agreement at any time upon material breach of the terms herein and failure to cure such breach within </w:t>
+      </w:r>
+      <w:r>
+        <w:rPr>
+          <w:rFonts w:ascii="Arial" w:eastAsia="ＭＳ Ｐゴシック" w:hAnsi="Arial" w:cs="Arial"/>
+          <w:b/>
+          <w:bCs/>
+          <w:kern w:val="0"/>
+          <w:sz w:val="24"/>
+          <w14:ligatures w14:val="none"/>
+        </w:rPr>
+        <w:t>30 days</w:t>
+      </w:r>
+      <w:r>
+        <w:rPr>
+          <w:rFonts w:ascii="Arial" w:eastAsia="ＭＳ Ｐゴシック" w:hAnsi="Arial" w:cs="Arial"/>
+          <w:kern w:val="0"/>
+          <w:sz w:val="24"/>
+          <w14:ligatures w14:val="none"/>
+        </w:rPr>
+        <w:t xml:space="preserve"> of notification.</w:t>
+      </w:r>
+    </w:p>
+    <w:p>
+      <w:pPr>
+        <w:widowControl/>
+        <w:spacing w:after="0" w:line="240" w:lineRule="auto"/>
+        <w:rPr>
+          <w:rFonts w:ascii="Arial" w:eastAsia="ＭＳ Ｐゴシック" w:hAnsi="Arial" w:cs="Arial"/>
+          <w:kern w:val="0"/>
+          <w:sz w:val="24"/>
+          <w14:ligatures w14:val="none"/>
+        </w:rPr>
+      </w:pPr>
+    </w:p>
+    <w:p>
+      <w:pPr>
+        <w:widowControl/>
+        <w:spacing w:before="100" w:beforeAutospacing="1" w:after="100" w:afterAutospacing="1" w:line="240" w:lineRule="auto"/>
+        <w:outlineLvl w:val="1"/>
+        <w:rPr>
+          <w:rFonts w:ascii="Arial" w:eastAsia="ＭＳ Ｐゴシック" w:hAnsi="Arial" w:cs="Arial"/>
+          <w:b/>
+          <w:bCs/>
+          <w:kern w:val="0"/>
+          <w:sz w:val="36"/>
+          <w:szCs w:val="36"/>
+          <w14:ligatures w14:val="none"/>
+        </w:rPr>
+      </w:pPr>
+      <w:r>
+        <w:rPr>
+          <w:rFonts w:ascii="Arial" w:eastAsia="ＭＳ Ｐゴシック" w:hAnsi="Arial" w:cs="Arial"/>
+          <w:b/>
+          <w:bCs/>
+          <w:kern w:val="0"/>
+          <w:sz w:val="36"/>
+          <w:szCs w:val="36"/>
+          <w14:ligatures w14:val="none"/>
+        </w:rPr>
+        <w:t>2. Delivery</w:t>
+      </w:r>
+    </w:p>
+    <w:p>
+      <w:pPr>
+        <w:widowControl/>
+        <w:numPr>
+          <w:ilvl w:val="0"/>
+          <w:numId w:val="6"/>
+        </w:numPr>
+        <w:spacing w:before="100" w:beforeAutospacing="1" w:after="100" w:afterAutospacing="1" w:line="240" w:lineRule="auto"/>
+        <w:rPr>
+          <w:rFonts w:ascii="Arial" w:eastAsia="ＭＳ Ｐゴシック" w:hAnsi="Arial" w:cs="Arial"/>
+          <w:kern w:val="0"/>
+          <w:sz w:val="24"/>
+          <w14:ligatures w14:val="none"/>
+        </w:rPr>
+      </w:pPr>
+      <w:r>
+        <w:rPr>
+          <w:rFonts w:ascii="Arial" w:eastAsia="ＭＳ Ｐゴシック" w:hAnsi="Arial" w:cs="Arial"/>
+          <w:kern w:val="0"/>
+          <w:sz w:val="24"/>
+          <w14:ligatures w14:val="none"/>
+        </w:rPr>
+        <w:t>The Software shall function in accordance with the Specifications on or before the Delivery Date.</w:t>
+      </w:r>
+    </w:p>
+    <w:p>
+      <w:pPr>
+        <w:widowControl/>
+        <w:numPr>
+          <w:ilvl w:val="0"/>
+          <w:numId w:val="6"/>
+        </w:numPr>
+        <w:spacing w:before="100" w:beforeAutospacing="1" w:after="100" w:afterAutospacing="1" w:line="240" w:lineRule="auto"/>
+        <w:rPr>
+          <w:rFonts w:ascii="Arial" w:eastAsia="ＭＳ Ｐゴシック" w:hAnsi="Arial" w:cs="Arial"/>
+          <w:kern w:val="0"/>
+          <w:sz w:val="24"/>
+          <w14:ligatures w14:val="none"/>
+        </w:rPr>
+      </w:pPr>
+      <w:r>
+        <w:rPr>
+          <w:rFonts w:ascii="Arial" w:eastAsia="ＭＳ Ｐゴシック" w:hAnsi="Arial" w:cs="Arial"/>
+          <w:kern w:val="0"/>
+          <w:sz w:val="24"/>
+          <w14:ligatures w14:val="none"/>
+        </w:rPr>
+        <w:t xml:space="preserve">If the delivered Software does not conform to the Specifications, the Client shall notify the Developer within </w:t>
+      </w:r>
+      <w:r>
+        <w:rPr>
+          <w:rFonts w:ascii="Arial" w:eastAsia="ＭＳ Ｐゴシック" w:hAnsi="Arial" w:cs="Arial"/>
+          <w:b/>
+          <w:bCs/>
+          <w:kern w:val="0"/>
+          <w:sz w:val="24"/>
+          <w14:ligatures w14:val="none"/>
+        </w:rPr>
+        <w:t>60 days</w:t>
+      </w:r>
+      <w:r>
+        <w:rPr>
+          <w:rFonts w:ascii="Arial" w:eastAsia="ＭＳ Ｐゴシック" w:hAnsi="Arial" w:cs="Arial"/>
+          <w:kern w:val="0"/>
+          <w:sz w:val="24"/>
+          <w14:ligatures w14:val="none"/>
+        </w:rPr>
+        <w:t xml:space="preserve"> of the Delivery Date with a written description of the issues. The Developer agrees to make reasonable efforts to correct any non-conformity.</w:t>
+      </w:r>
+    </w:p>
+    <w:p>
+      <w:pPr>
+        <w:widowControl/>
+        <w:numPr>
+          <w:ilvl w:val="0"/>
+          <w:numId w:val="6"/>
+        </w:numPr>
+        <w:spacing w:before="100" w:beforeAutospacing="1" w:after="100" w:afterAutospacing="1" w:line="240" w:lineRule="auto"/>
+        <w:rPr>
+          <w:rFonts w:ascii="Arial" w:eastAsia="ＭＳ Ｐゴシック" w:hAnsi="Arial" w:cs="Arial"/>
+          <w:kern w:val="0"/>
+          <w:sz w:val="24"/>
+          <w14:ligatures w14:val="none"/>
+        </w:rPr>
+      </w:pPr>
+      <w:r>
+        <w:rPr>
+          <w:rFonts w:ascii="Arial" w:eastAsia="ＭＳ Ｐゴシック" w:hAnsi="Arial" w:cs="Arial"/>
+          <w:kern w:val="0"/>
+          <w:sz w:val="24"/>
+          <w14:ligatures w14:val="none"/>
+        </w:rPr>
+        <w:t xml:space="preserve">The Client shall provide a written notice of acceptance (or rejection) based on conformity to the Specifications within </w:t>
+      </w:r>
+      <w:r>
+        <w:rPr>
+          <w:rFonts w:ascii="Arial" w:eastAsia="ＭＳ Ｐゴシック" w:hAnsi="Arial" w:cs="Arial"/>
+          <w:b/>
+          <w:bCs/>
+          <w:kern w:val="0"/>
+          <w:sz w:val="24"/>
+          <w14:ligatures w14:val="none"/>
+        </w:rPr>
+        <w:t>60 days</w:t>
+      </w:r>
+      <w:r>
+        <w:rPr>
+          <w:rFonts w:ascii="Arial" w:eastAsia="ＭＳ Ｐゴシック" w:hAnsi="Arial" w:cs="Arial"/>
+          <w:kern w:val="0"/>
+          <w:sz w:val="24"/>
+          <w14:ligatures w14:val="none"/>
+        </w:rPr>
+        <w:t xml:space="preserve"> of the Delivery Date.</w:t>
+      </w:r>
+    </w:p>
+    <w:p>
+      <w:pPr>
+        <w:widowControl/>
+        <w:spacing w:after="0" w:line="240" w:lineRule="auto"/>
+        <w:rPr>
+          <w:rFonts w:ascii="Arial" w:eastAsia="ＭＳ Ｐゴシック" w:hAnsi="Arial" w:cs="Arial"/>
+          <w:kern w:val="0"/>
+          <w:sz w:val="24"/>
+          <w14:ligatures w14:val="none"/>
+        </w:rPr>
+      </w:pPr>
+    </w:p>
+    <w:p>
+      <w:pPr>
+        <w:widowControl/>
+        <w:spacing w:before="100" w:beforeAutospacing="1" w:after="100" w:afterAutospacing="1" w:line="240" w:lineRule="auto"/>
+        <w:outlineLvl w:val="1"/>
+        <w:rPr>
+          <w:rFonts w:ascii="Arial" w:eastAsia="ＭＳ Ｐゴシック" w:hAnsi="Arial" w:cs="Arial"/>
+          <w:b/>
+          <w:bCs/>
+          <w:kern w:val="0"/>
+          <w:sz w:val="36"/>
+          <w:szCs w:val="36"/>
+          <w14:ligatures w14:val="none"/>
+        </w:rPr>
+      </w:pPr>
+      <w:r>
+        <w:rPr>
+          <w:rFonts w:ascii="Arial" w:eastAsia="ＭＳ Ｐゴシック" w:hAnsi="Arial" w:cs="Arial"/>
+          <w:b/>
+          <w:bCs/>
+          <w:kern w:val="0"/>
+          <w:sz w:val="36"/>
+          <w:szCs w:val="36"/>
+          <w14:ligatures w14:val="none"/>
+        </w:rPr>
+        <w:t>3. Compensation</w:t>
+      </w:r>
+    </w:p>
+    <w:p>
+      <w:pPr>
+        <w:widowControl/>
+        <w:spacing w:before="100" w:beforeAutospacing="1" w:after="100" w:afterAutospacing="1" w:line="240" w:lineRule="auto"/>
+        <w:rPr>
+          <w:rFonts w:ascii="Arial" w:eastAsia="ＭＳ Ｐゴシック" w:hAnsi="Arial" w:cs="Arial"/>
+          <w:kern w:val="0"/>
+          <w:sz w:val="24"/>
+          <w14:ligatures w14:val="none"/>
+        </w:rPr>
+      </w:pPr>
+      <w:r>
+        <w:rPr>
+          <w:rFonts w:ascii="Arial" w:eastAsia="ＭＳ Ｐゴシック" w:hAnsi="Arial" w:cs="Arial"/>
+          <w:kern w:val="0"/>
+          <w:sz w:val="24"/>
+          <w14:ligatures w14:val="none"/>
+        </w:rPr>
+        <w:t xml:space="preserve">The Client shall pay the Developer for the services as per the development phases described in </w:t>
+      </w:r>
+      <w:r>
+        <w:rPr>
+          <w:rFonts w:ascii="Arial" w:eastAsia="ＭＳ Ｐゴシック" w:hAnsi="Arial" w:cs="Arial"/>
+          <w:color w:val="FF0000"/>
+          <w:kern w:val="0"/>
+          <w:sz w:val="24"/>
+          <w14:ligatures w14:val="none"/>
+        </w:rPr>
+        <w:t>Exhibit B</w:t>
+      </w:r>
+      <w:r>
+        <w:rPr>
+          <w:rFonts w:ascii="Arial" w:eastAsia="ＭＳ Ｐゴシック" w:hAnsi="Arial" w:cs="Arial"/>
+          <w:kern w:val="0"/>
+          <w:sz w:val="24"/>
+          <w14:ligatures w14:val="none"/>
+        </w:rPr>
+        <w:t xml:space="preserve">. Payment amounts and timelines are detailed therein. The dates listed in </w:t>
+      </w:r>
+      <w:r>
+        <w:rPr>
+          <w:rFonts w:ascii="Arial" w:eastAsia="ＭＳ Ｐゴシック" w:hAnsi="Arial" w:cs="Arial"/>
+          <w:color w:val="FF0000"/>
+          <w:kern w:val="0"/>
+          <w:sz w:val="24"/>
+          <w14:ligatures w14:val="none"/>
+        </w:rPr>
+        <w:t>Exhibit B</w:t>
+      </w:r>
+      <w:r>
+        <w:rPr>
+          <w:rFonts w:ascii="Arial" w:eastAsia="ＭＳ Ｐゴシック" w:hAnsi="Arial" w:cs="Arial"/>
+          <w:kern w:val="0"/>
+          <w:sz w:val="24"/>
+          <w14:ligatures w14:val="none"/>
+        </w:rPr>
+        <w:t xml:space="preserve"> for each development phase are for reference only. The Developer will provide advance notice (approximately two weeks prior) and inform the Client of the actual delivery dates based on the progress of development.</w:t>
+      </w:r>
+    </w:p>
+    <w:p>
+      <w:pPr>
+        <w:widowControl/>
+        <w:spacing w:after="0" w:line="240" w:lineRule="auto"/>
+        <w:rPr>
+          <w:rFonts w:ascii="Arial" w:eastAsia="ＭＳ Ｐゴシック" w:hAnsi="Arial" w:cs="Arial"/>
+          <w:kern w:val="0"/>
+          <w:sz w:val="24"/>
+          <w14:ligatures w14:val="none"/>
+        </w:rPr>
+      </w:pPr>
+    </w:p>
+    <w:p>
+      <w:pPr>
+        <w:widowControl/>
+        <w:spacing w:before="100" w:beforeAutospacing="1" w:after="100" w:afterAutospacing="1" w:line="240" w:lineRule="auto"/>
+        <w:outlineLvl w:val="1"/>
+        <w:rPr>
+          <w:rFonts w:ascii="Arial" w:eastAsia="ＭＳ Ｐゴシック" w:hAnsi="Arial" w:cs="Arial"/>
+          <w:b/>
+          <w:bCs/>
+          <w:kern w:val="0"/>
+          <w:sz w:val="36"/>
+          <w:szCs w:val="36"/>
+          <w14:ligatures w14:val="none"/>
+        </w:rPr>
+      </w:pPr>
+      <w:r>
+        <w:rPr>
+          <w:rFonts w:ascii="Arial" w:eastAsia="ＭＳ Ｐゴシック" w:hAnsi="Arial" w:cs="Arial"/>
+          <w:b/>
+          <w:bCs/>
+          <w:kern w:val="0"/>
+          <w:sz w:val="36"/>
+          <w:szCs w:val="36"/>
+          <w14:ligatures w14:val="none"/>
+        </w:rPr>
+        <w:t>4. Intellectual Property Rights</w:t>
+      </w:r>
+    </w:p>
+    <w:p>
+      <w:pPr>
+        <w:widowControl/>
+        <w:numPr>
+          <w:ilvl w:val="0"/>
+          <w:numId w:val="7"/>
+        </w:numPr>
+        <w:spacing w:before="100" w:beforeAutospacing="1" w:after="100" w:afterAutospacing="1" w:line="240" w:lineRule="auto"/>
+        <w:rPr>
+          <w:rFonts w:ascii="Arial" w:eastAsia="ＭＳ Ｐゴシック" w:hAnsi="Arial" w:cs="Arial"/>
+          <w:kern w:val="0"/>
+          <w:sz w:val="24"/>
+          <w14:ligatures w14:val="none"/>
+        </w:rPr>
+      </w:pPr>
+      <w:r>
+        <w:rPr>
+          <w:rFonts w:ascii="Arial" w:eastAsia="ＭＳ Ｐゴシック" w:hAnsi="Arial" w:cs="Arial"/>
+          <w:kern w:val="0"/>
+          <w:sz w:val="24"/>
+          <w14:ligatures w14:val="none"/>
+        </w:rPr>
+        <w:t xml:space="preserve">All intellectual property rights specifically created for the QR code payment feature, including but not limited to source code and </w:t>
+      </w:r>
+      <w:r>
+        <w:rPr>
+          <w:rFonts w:ascii="Arial" w:eastAsia="ＭＳ Ｐゴシック" w:hAnsi="Arial" w:cs="Arial"/>
+          <w:kern w:val="0"/>
+          <w:sz w:val="24"/>
+          <w14:ligatures w14:val="none"/>
+        </w:rPr>
+        <w:lastRenderedPageBreak/>
+        <w:t>documentation developed exclusively for this project, shall be owned by the Client.</w:t>
+      </w:r>
+    </w:p>
+    <w:p>
+      <w:pPr>
+        <w:widowControl/>
+        <w:numPr>
+          <w:ilvl w:val="0"/>
+          <w:numId w:val="7"/>
+        </w:numPr>
+        <w:spacing w:before="100" w:beforeAutospacing="1" w:after="100" w:afterAutospacing="1" w:line="240" w:lineRule="auto"/>
+        <w:rPr>
+          <w:rFonts w:ascii="Arial" w:eastAsia="ＭＳ Ｐゴシック" w:hAnsi="Arial" w:cs="Arial"/>
+          <w:kern w:val="0"/>
+          <w:sz w:val="24"/>
+          <w14:ligatures w14:val="none"/>
+        </w:rPr>
+      </w:pPr>
+      <w:r>
+        <w:rPr>
+          <w:rFonts w:ascii="Arial" w:eastAsia="ＭＳ Ｐゴシック" w:hAnsi="Arial" w:cs="Arial"/>
+          <w:kern w:val="0"/>
+          <w:sz w:val="24"/>
+          <w14:ligatures w14:val="none"/>
+        </w:rPr>
+        <w:t>The Developer retains ownership of all pre-existing intellectual property, general methodologies, know-how, and technologies that existed prior to this agreement or that are generally applicable across multiple projects.</w:t>
+      </w:r>
+    </w:p>
+    <w:p>
+      <w:pPr>
+        <w:widowControl/>
+        <w:numPr>
+          <w:ilvl w:val="0"/>
+          <w:numId w:val="7"/>
+        </w:numPr>
+        <w:spacing w:before="100" w:beforeAutospacing="1" w:after="100" w:afterAutospacing="1" w:line="240" w:lineRule="auto"/>
+        <w:rPr>
+          <w:rFonts w:ascii="Arial" w:eastAsia="ＭＳ Ｐゴシック" w:hAnsi="Arial" w:cs="Arial"/>
+          <w:kern w:val="0"/>
+          <w:sz w:val="24"/>
+          <w14:ligatures w14:val="none"/>
+        </w:rPr>
+      </w:pPr>
+      <w:r>
+        <w:rPr>
+          <w:rFonts w:ascii="Arial" w:eastAsia="ＭＳ Ｐゴシック" w:hAnsi="Arial" w:cs="Arial"/>
+          <w:kern w:val="0"/>
+          <w:sz w:val="24"/>
+          <w14:ligatures w14:val="none"/>
+        </w:rPr>
+        <w:t>The Developer grants the Client a perpetual, non-exclusive license to use such pre-existing technology solely in connection with the delivered Software.</w:t>
+      </w:r>
+    </w:p>
+    <w:p>
+      <w:pPr>
+        <w:widowControl/>
+        <w:numPr>
+          <w:ilvl w:val="0"/>
+          <w:numId w:val="7"/>
+        </w:numPr>
+        <w:spacing w:before="100" w:beforeAutospacing="1" w:after="100" w:afterAutospacing="1" w:line="240" w:lineRule="auto"/>
+        <w:rPr>
+          <w:rFonts w:ascii="Arial" w:eastAsia="ＭＳ Ｐゴシック" w:hAnsi="Arial" w:cs="Arial"/>
+          <w:kern w:val="0"/>
+          <w:sz w:val="24"/>
+          <w14:ligatures w14:val="none"/>
+        </w:rPr>
+      </w:pPr>
+      <w:r>
+        <w:rPr>
+          <w:rFonts w:ascii="Arial" w:eastAsia="ＭＳ Ｐゴシック" w:hAnsi="Arial" w:cs="Arial"/>
+          <w:kern w:val="0"/>
+          <w:sz w:val="24"/>
+          <w14:ligatures w14:val="none"/>
+        </w:rPr>
+        <w:t>For existing technologies used in this project, including deliverables from past projects owned by the Client, both parties mutually grant permission for use in this project.</w:t>
+      </w:r>
+    </w:p>
+    <w:p>
+      <w:pPr>
+        <w:widowControl/>
+        <w:spacing w:after="0" w:line="240" w:lineRule="auto"/>
+        <w:rPr>
+          <w:rFonts w:ascii="Arial" w:eastAsia="ＭＳ Ｐゴシック" w:hAnsi="Arial" w:cs="Arial"/>
+          <w:kern w:val="0"/>
+          <w:sz w:val="24"/>
+          <w14:ligatures w14:val="none"/>
+        </w:rPr>
+      </w:pPr>
+    </w:p>
+    <w:p>
+      <w:pPr>
+        <w:widowControl/>
+        <w:spacing w:before="100" w:beforeAutospacing="1" w:after="100" w:afterAutospacing="1" w:line="240" w:lineRule="auto"/>
+        <w:outlineLvl w:val="1"/>
+        <w:rPr>
+          <w:rFonts w:ascii="Arial" w:eastAsia="ＭＳ Ｐゴシック" w:hAnsi="Arial" w:cs="Arial"/>
+          <w:b/>
+          <w:bCs/>
+          <w:kern w:val="0"/>
+          <w:sz w:val="36"/>
+          <w:szCs w:val="36"/>
+          <w14:ligatures w14:val="none"/>
+        </w:rPr>
+      </w:pPr>
+      <w:r>
+        <w:rPr>
+          <w:rFonts w:ascii="Arial" w:eastAsia="ＭＳ Ｐゴシック" w:hAnsi="Arial" w:cs="Arial"/>
+          <w:b/>
+          <w:bCs/>
+          <w:kern w:val="0"/>
+          <w:sz w:val="36"/>
+          <w:szCs w:val="36"/>
+          <w14:ligatures w14:val="none"/>
+        </w:rPr>
+        <w:t>5. Change in Specifications</w:t>
+      </w:r>
+    </w:p>
+    <w:p>
+      <w:pPr>
+        <w:widowControl/>
+        <w:numPr>
+          <w:ilvl w:val="0"/>
+          <w:numId w:val="8"/>
+        </w:numPr>
+        <w:spacing w:before="100" w:beforeAutospacing="1" w:after="100" w:afterAutospacing="1" w:line="240" w:lineRule="auto"/>
+        <w:rPr>
+          <w:rFonts w:ascii="Arial" w:eastAsia="ＭＳ Ｐゴシック" w:hAnsi="Arial" w:cs="Arial"/>
+          <w:kern w:val="0"/>
+          <w:sz w:val="24"/>
+          <w14:ligatures w14:val="none"/>
+        </w:rPr>
+      </w:pPr>
+      <w:r>
+        <w:rPr>
+          <w:rFonts w:ascii="Arial" w:eastAsia="ＭＳ Ｐゴシック" w:hAnsi="Arial" w:cs="Arial"/>
+          <w:kern w:val="0"/>
+          <w:sz w:val="24"/>
+          <w14:ligatures w14:val="none"/>
+        </w:rPr>
+        <w:t>Change requests may be made by the Client through a formal change control process.</w:t>
+      </w:r>
+    </w:p>
+    <w:p>
+      <w:pPr>
+        <w:widowControl/>
+        <w:numPr>
+          <w:ilvl w:val="0"/>
+          <w:numId w:val="8"/>
+        </w:numPr>
+        <w:spacing w:before="100" w:beforeAutospacing="1" w:after="100" w:afterAutospacing="1" w:line="240" w:lineRule="auto"/>
+        <w:rPr>
+          <w:rFonts w:ascii="Arial" w:eastAsia="ＭＳ Ｐゴシック" w:hAnsi="Arial" w:cs="Arial"/>
+          <w:kern w:val="0"/>
+          <w:sz w:val="24"/>
+          <w14:ligatures w14:val="none"/>
+        </w:rPr>
+      </w:pPr>
+      <w:r>
+        <w:rPr>
+          <w:rFonts w:ascii="Arial" w:eastAsia="ＭＳ Ｐゴシック" w:hAnsi="Arial" w:cs="Arial"/>
+          <w:kern w:val="0"/>
+          <w:sz w:val="24"/>
+          <w14:ligatures w14:val="none"/>
+        </w:rPr>
+        <w:t>Any changes that materially alter the scope, timeline, or cost of the project must be documented in writing and approved by both parties before implementation.</w:t>
+      </w:r>
+    </w:p>
+    <w:p>
+      <w:pPr>
+        <w:widowControl/>
+        <w:numPr>
+          <w:ilvl w:val="0"/>
+          <w:numId w:val="8"/>
+        </w:numPr>
+        <w:spacing w:before="100" w:beforeAutospacing="1" w:after="100" w:afterAutospacing="1" w:line="240" w:lineRule="auto"/>
+        <w:rPr>
+          <w:rFonts w:ascii="Arial" w:eastAsia="ＭＳ Ｐゴシック" w:hAnsi="Arial" w:cs="Arial"/>
+          <w:kern w:val="0"/>
+          <w:sz w:val="24"/>
+          <w14:ligatures w14:val="none"/>
+        </w:rPr>
+      </w:pPr>
+      <w:r>
+        <w:rPr>
+          <w:rFonts w:ascii="Arial" w:eastAsia="ＭＳ Ｐゴシック" w:hAnsi="Arial" w:cs="Arial"/>
+          <w:kern w:val="0"/>
+          <w:sz w:val="24"/>
+          <w14:ligatures w14:val="none"/>
+        </w:rPr>
+        <w:t>The Developer shall provide a written estimate of additional time and cost within 5 business days of receiving a change request.</w:t>
+      </w:r>
+    </w:p>
+    <w:p>
+      <w:pPr>
+        <w:widowControl/>
+        <w:numPr>
+          <w:ilvl w:val="0"/>
+          <w:numId w:val="8"/>
+        </w:numPr>
+        <w:spacing w:before="100" w:beforeAutospacing="1" w:after="100" w:afterAutospacing="1" w:line="240" w:lineRule="auto"/>
+        <w:rPr>
+          <w:rFonts w:ascii="Arial" w:eastAsia="ＭＳ Ｐゴシック" w:hAnsi="Arial" w:cs="Arial"/>
+          <w:kern w:val="0"/>
+          <w:sz w:val="24"/>
+          <w14:ligatures w14:val="none"/>
+        </w:rPr>
+      </w:pPr>
+      <w:r>
+        <w:rPr>
+          <w:rFonts w:ascii="Arial" w:eastAsia="ＭＳ Ｐゴシック" w:hAnsi="Arial" w:cs="Arial"/>
+          <w:kern w:val="0"/>
+          <w:sz w:val="24"/>
+          <w14:ligatures w14:val="none"/>
+        </w:rPr>
+        <w:t>The Client's written approval is required before proceeding with any changes that incur additional costs or extend delivery timelines.</w:t>
+      </w:r>
+    </w:p>
+    <w:p>
+      <w:pPr>
+        <w:widowControl/>
+        <w:spacing w:after="0" w:line="240" w:lineRule="auto"/>
+        <w:rPr>
+          <w:rFonts w:ascii="Arial" w:eastAsia="ＭＳ Ｐゴシック" w:hAnsi="Arial" w:cs="Arial"/>
+          <w:kern w:val="0"/>
+          <w:sz w:val="24"/>
+          <w14:ligatures w14:val="none"/>
+        </w:rPr>
+      </w:pPr>
+    </w:p>
+    <w:p>
+      <w:pPr>
+        <w:widowControl/>
+        <w:spacing w:before="100" w:beforeAutospacing="1" w:after="100" w:afterAutospacing="1" w:line="240" w:lineRule="auto"/>
+        <w:outlineLvl w:val="1"/>
+        <w:rPr>
+          <w:rFonts w:ascii="Arial" w:eastAsia="ＭＳ Ｐゴシック" w:hAnsi="Arial" w:cs="Arial"/>
+          <w:b/>
+          <w:bCs/>
+          <w:kern w:val="0"/>
+          <w:sz w:val="36"/>
+          <w:szCs w:val="36"/>
+          <w14:ligatures w14:val="none"/>
+        </w:rPr>
+      </w:pPr>
+      <w:r>
+        <w:rPr>
+          <w:rFonts w:ascii="Arial" w:eastAsia="ＭＳ Ｐゴシック" w:hAnsi="Arial" w:cs="Arial"/>
+          <w:b/>
+          <w:bCs/>
+          <w:kern w:val="0"/>
+          <w:sz w:val="36"/>
+          <w:szCs w:val="36"/>
+          <w14:ligatures w14:val="none"/>
+        </w:rPr>
+        <w:t>6. Confidentiality</w:t>
+      </w:r>
+    </w:p>
+    <w:p>
+      <w:pPr>
+        <w:widowControl/>
+        <w:spacing w:before="100" w:beforeAutospacing="1" w:after="100" w:afterAutospacing="1" w:line="240" w:lineRule="auto"/>
+        <w:rPr>
+          <w:rFonts w:ascii="Arial" w:eastAsia="ＭＳ Ｐゴシック" w:hAnsi="Arial" w:cs="Arial"/>
+          <w:kern w:val="0"/>
+          <w:sz w:val="24"/>
+          <w14:ligatures w14:val="none"/>
+        </w:rPr>
+      </w:pPr>
+      <w:r>
+        <w:rPr>
+          <w:rFonts w:ascii="Arial" w:eastAsia="ＭＳ Ｐゴシック" w:hAnsi="Arial" w:cs="Arial"/>
+          <w:kern w:val="0"/>
+          <w:sz w:val="24"/>
+          <w14:ligatures w14:val="none"/>
+        </w:rPr>
+        <w:t xml:space="preserve">Both parties agree to maintain strict confidentiality regarding all business and technical information obtained from the other party </w:t>
+      </w:r>
+      <w:proofErr w:type="gramStart"/>
+      <w:r>
+        <w:rPr>
+          <w:rFonts w:ascii="Arial" w:eastAsia="ＭＳ Ｐゴシック" w:hAnsi="Arial" w:cs="Arial"/>
+          <w:kern w:val="0"/>
+          <w:sz w:val="24"/>
+          <w14:ligatures w14:val="none"/>
+        </w:rPr>
+        <w:t>during the course of</w:t>
+      </w:r>
+      <w:proofErr w:type="gramEnd"/>
+      <w:r>
+        <w:rPr>
+          <w:rFonts w:ascii="Arial" w:eastAsia="ＭＳ Ｐゴシック" w:hAnsi="Arial" w:cs="Arial"/>
+          <w:kern w:val="0"/>
+          <w:sz w:val="24"/>
+          <w14:ligatures w14:val="none"/>
+        </w:rPr>
+        <w:t xml:space="preserve"> this agreement. This mutual obligation includes, but is not limited to, specifications, source code, business plans, methodologies, and know-how. No unauthorized use, disclosure, or duplication of confidential information is permitted. This </w:t>
+      </w:r>
+      <w:r>
+        <w:rPr>
+          <w:rFonts w:ascii="Arial" w:eastAsia="ＭＳ Ｐゴシック" w:hAnsi="Arial" w:cs="Arial"/>
+          <w:kern w:val="0"/>
+          <w:sz w:val="24"/>
+          <w14:ligatures w14:val="none"/>
+        </w:rPr>
+        <w:lastRenderedPageBreak/>
+        <w:t xml:space="preserve">confidentiality obligation shall remain in effect for a period of </w:t>
+      </w:r>
+      <w:r>
+        <w:rPr>
+          <w:rFonts w:ascii="Arial" w:eastAsia="ＭＳ Ｐゴシック" w:hAnsi="Arial" w:cs="Arial"/>
+          <w:b/>
+          <w:bCs/>
+          <w:kern w:val="0"/>
+          <w:sz w:val="24"/>
+          <w14:ligatures w14:val="none"/>
+        </w:rPr>
+        <w:t>3 years</w:t>
+      </w:r>
+      <w:r>
+        <w:rPr>
+          <w:rFonts w:ascii="Arial" w:eastAsia="ＭＳ Ｐゴシック" w:hAnsi="Arial" w:cs="Arial"/>
+          <w:kern w:val="0"/>
+          <w:sz w:val="24"/>
+          <w14:ligatures w14:val="none"/>
+        </w:rPr>
+        <w:t xml:space="preserve"> following the termination or expiration of this agreement.</w:t>
+      </w:r>
+    </w:p>
+    <w:p>
+      <w:pPr>
+        <w:widowControl/>
+        <w:spacing w:after="0" w:line="240" w:lineRule="auto"/>
+        <w:rPr>
+          <w:rFonts w:ascii="Arial" w:eastAsia="ＭＳ Ｐゴシック" w:hAnsi="Arial" w:cs="Arial"/>
+          <w:kern w:val="0"/>
+          <w:sz w:val="24"/>
+          <w14:ligatures w14:val="none"/>
+        </w:rPr>
+      </w:pPr>
+    </w:p>
+    <w:p>
+      <w:pPr>
+        <w:widowControl/>
+        <w:spacing w:before="100" w:beforeAutospacing="1" w:after="100" w:afterAutospacing="1" w:line="240" w:lineRule="auto"/>
+        <w:outlineLvl w:val="1"/>
+        <w:rPr>
+          <w:rFonts w:ascii="Arial" w:eastAsia="ＭＳ Ｐゴシック" w:hAnsi="Arial" w:cs="Arial"/>
+          <w:b/>
+          <w:bCs/>
+          <w:kern w:val="0"/>
+          <w:sz w:val="36"/>
+          <w:szCs w:val="36"/>
+          <w14:ligatures w14:val="none"/>
+        </w:rPr>
+      </w:pPr>
+      <w:r>
+        <w:rPr>
+          <w:rFonts w:ascii="Arial" w:eastAsia="ＭＳ Ｐゴシック" w:hAnsi="Arial" w:cs="Arial"/>
+          <w:b/>
+          <w:bCs/>
+          <w:kern w:val="0"/>
+          <w:sz w:val="36"/>
+          <w:szCs w:val="36"/>
+          <w14:ligatures w14:val="none"/>
+        </w:rPr>
+        <w:t>7. Developer Warranties</w:t>
+      </w:r>
+    </w:p>
+    <w:p>
+      <w:pPr>
+        <w:widowControl/>
+        <w:spacing w:before="100" w:beforeAutospacing="1" w:after="100" w:afterAutospacing="1" w:line="240" w:lineRule="auto"/>
+        <w:rPr>
+          <w:rFonts w:ascii="Arial" w:eastAsia="ＭＳ Ｐゴシック" w:hAnsi="Arial" w:cs="Arial"/>
+          <w:kern w:val="0"/>
+          <w:sz w:val="24"/>
+          <w14:ligatures w14:val="none"/>
+        </w:rPr>
+      </w:pPr>
+      <w:r>
+        <w:rPr>
+          <w:rFonts w:ascii="Arial" w:eastAsia="ＭＳ Ｐゴシック" w:hAnsi="Arial" w:cs="Arial"/>
+          <w:kern w:val="0"/>
+          <w:sz w:val="24"/>
+          <w14:ligatures w14:val="none"/>
+        </w:rPr>
+        <w:t>The Developer represents and warrants that:</w:t>
+      </w:r>
+    </w:p>
+    <w:p>
+      <w:pPr>
+        <w:widowControl/>
+        <w:numPr>
+          <w:ilvl w:val="0"/>
+          <w:numId w:val="9"/>
+        </w:numPr>
+        <w:spacing w:before="100" w:beforeAutospacing="1" w:after="100" w:afterAutospacing="1" w:line="240" w:lineRule="auto"/>
+        <w:rPr>
+          <w:rFonts w:ascii="Arial" w:eastAsia="ＭＳ Ｐゴシック" w:hAnsi="Arial" w:cs="Arial"/>
+          <w:kern w:val="0"/>
+          <w:sz w:val="24"/>
+          <w14:ligatures w14:val="none"/>
+        </w:rPr>
+      </w:pPr>
+      <w:r>
+        <w:rPr>
+          <w:rFonts w:ascii="Arial" w:eastAsia="ＭＳ Ｐゴシック" w:hAnsi="Arial" w:cs="Arial"/>
+          <w:kern w:val="0"/>
+          <w:sz w:val="24"/>
+          <w14:ligatures w14:val="none"/>
+        </w:rPr>
+        <w:t>No existing contract prohibits the Developer from entering into this agreement.</w:t>
+      </w:r>
+    </w:p>
+    <w:p>
+      <w:pPr>
+        <w:widowControl/>
+        <w:numPr>
+          <w:ilvl w:val="0"/>
+          <w:numId w:val="9"/>
+        </w:numPr>
+        <w:spacing w:before="100" w:beforeAutospacing="1" w:after="100" w:afterAutospacing="1" w:line="240" w:lineRule="auto"/>
+        <w:rPr>
+          <w:rFonts w:ascii="Arial" w:eastAsia="ＭＳ Ｐゴシック" w:hAnsi="Arial" w:cs="Arial"/>
+          <w:kern w:val="0"/>
+          <w:sz w:val="24"/>
+          <w14:ligatures w14:val="none"/>
+        </w:rPr>
+      </w:pPr>
+      <w:r>
+        <w:rPr>
+          <w:rFonts w:ascii="Arial" w:eastAsia="ＭＳ Ｐゴシック" w:hAnsi="Arial" w:cs="Arial"/>
+          <w:kern w:val="0"/>
+          <w:sz w:val="24"/>
+          <w14:ligatures w14:val="none"/>
+        </w:rPr>
+        <w:t>The Software will not infringe on any third-party intellectual property rights.</w:t>
+      </w:r>
+    </w:p>
+    <w:p>
+      <w:pPr>
+        <w:widowControl/>
+        <w:numPr>
+          <w:ilvl w:val="0"/>
+          <w:numId w:val="9"/>
+        </w:numPr>
+        <w:spacing w:before="100" w:beforeAutospacing="1" w:after="100" w:afterAutospacing="1" w:line="240" w:lineRule="auto"/>
+        <w:rPr>
+          <w:rFonts w:ascii="Arial" w:eastAsia="ＭＳ Ｐゴシック" w:hAnsi="Arial" w:cs="Arial"/>
+          <w:kern w:val="0"/>
+          <w:sz w:val="24"/>
+          <w14:ligatures w14:val="none"/>
+        </w:rPr>
+      </w:pPr>
+      <w:r>
+        <w:rPr>
+          <w:rFonts w:ascii="Arial" w:eastAsia="ＭＳ Ｐゴシック" w:hAnsi="Arial" w:cs="Arial"/>
+          <w:kern w:val="0"/>
+          <w:sz w:val="24"/>
+          <w14:ligatures w14:val="none"/>
+        </w:rPr>
+        <w:t xml:space="preserve">The Software will operate according to the Specifications for </w:t>
+      </w:r>
+      <w:r>
+        <w:rPr>
+          <w:rFonts w:ascii="Arial" w:eastAsia="ＭＳ Ｐゴシック" w:hAnsi="Arial" w:cs="Arial"/>
+          <w:b/>
+          <w:bCs/>
+          <w:kern w:val="0"/>
+          <w:sz w:val="24"/>
+          <w14:ligatures w14:val="none"/>
+        </w:rPr>
+        <w:t>60 days</w:t>
+      </w:r>
+      <w:r>
+        <w:rPr>
+          <w:rFonts w:ascii="Arial" w:eastAsia="ＭＳ Ｐゴシック" w:hAnsi="Arial" w:cs="Arial"/>
+          <w:kern w:val="0"/>
+          <w:sz w:val="24"/>
+          <w14:ligatures w14:val="none"/>
+        </w:rPr>
+        <w:t xml:space="preserve"> after delivery. Any malfunction during that time will be remedied at no extra cost, provided that such malfunction is not caused by:</w:t>
+      </w:r>
+    </w:p>
+    <w:p>
+      <w:pPr>
+        <w:widowControl/>
+        <w:numPr>
+          <w:ilvl w:val="1"/>
+          <w:numId w:val="9"/>
+        </w:numPr>
+        <w:spacing w:before="100" w:beforeAutospacing="1" w:after="100" w:afterAutospacing="1" w:line="240" w:lineRule="auto"/>
+        <w:rPr>
+          <w:rFonts w:ascii="Arial" w:eastAsia="ＭＳ Ｐゴシック" w:hAnsi="Arial" w:cs="Arial"/>
+          <w:kern w:val="0"/>
+          <w:sz w:val="24"/>
+          <w14:ligatures w14:val="none"/>
+        </w:rPr>
+      </w:pPr>
+      <w:r>
+        <w:rPr>
+          <w:rFonts w:ascii="Arial" w:eastAsia="ＭＳ Ｐゴシック" w:hAnsi="Arial" w:cs="Arial"/>
+          <w:kern w:val="0"/>
+          <w:sz w:val="24"/>
+          <w14:ligatures w14:val="none"/>
+        </w:rPr>
+        <w:t>Modifications made by the Client,</w:t>
+      </w:r>
+    </w:p>
+    <w:p>
+      <w:pPr>
+        <w:widowControl/>
+        <w:numPr>
+          <w:ilvl w:val="1"/>
+          <w:numId w:val="9"/>
+        </w:numPr>
+        <w:spacing w:before="100" w:beforeAutospacing="1" w:after="100" w:afterAutospacing="1" w:line="240" w:lineRule="auto"/>
+        <w:rPr>
+          <w:rFonts w:ascii="Arial" w:eastAsia="ＭＳ Ｐゴシック" w:hAnsi="Arial" w:cs="Arial"/>
+          <w:kern w:val="0"/>
+          <w:sz w:val="24"/>
+          <w14:ligatures w14:val="none"/>
+        </w:rPr>
+      </w:pPr>
+      <w:r>
+        <w:rPr>
+          <w:rFonts w:ascii="Arial" w:eastAsia="ＭＳ Ｐゴシック" w:hAnsi="Arial" w:cs="Arial"/>
+          <w:kern w:val="0"/>
+          <w:sz w:val="24"/>
+          <w14:ligatures w14:val="none"/>
+        </w:rPr>
+        <w:t>Third-party integrations, or</w:t>
+      </w:r>
+    </w:p>
+    <w:p>
+      <w:pPr>
+        <w:widowControl/>
+        <w:numPr>
+          <w:ilvl w:val="1"/>
+          <w:numId w:val="9"/>
+        </w:numPr>
+        <w:spacing w:before="100" w:beforeAutospacing="1" w:after="100" w:afterAutospacing="1" w:line="240" w:lineRule="auto"/>
+        <w:rPr>
+          <w:rFonts w:ascii="Arial" w:eastAsia="ＭＳ Ｐゴシック" w:hAnsi="Arial" w:cs="Arial"/>
+          <w:kern w:val="0"/>
+          <w:sz w:val="24"/>
+          <w14:ligatures w14:val="none"/>
+        </w:rPr>
+      </w:pPr>
+      <w:r>
+        <w:rPr>
+          <w:rFonts w:ascii="Arial" w:eastAsia="ＭＳ Ｐゴシック" w:hAnsi="Arial" w:cs="Arial"/>
+          <w:kern w:val="0"/>
+          <w:sz w:val="24"/>
+          <w14:ligatures w14:val="none"/>
+        </w:rPr>
+        <w:t>Environmental factors beyond the Developer's control.</w:t>
+      </w:r>
+    </w:p>
+    <w:p>
+      <w:pPr>
+        <w:widowControl/>
+        <w:spacing w:after="0" w:line="240" w:lineRule="auto"/>
+        <w:rPr>
+          <w:rFonts w:ascii="Arial" w:eastAsia="ＭＳ Ｐゴシック" w:hAnsi="Arial" w:cs="Arial"/>
+          <w:kern w:val="0"/>
+          <w:sz w:val="24"/>
+          <w14:ligatures w14:val="none"/>
+        </w:rPr>
+      </w:pPr>
+    </w:p>
+    <w:p>
+      <w:pPr>
+        <w:widowControl/>
+        <w:spacing w:before="100" w:beforeAutospacing="1" w:after="100" w:afterAutospacing="1" w:line="240" w:lineRule="auto"/>
+        <w:outlineLvl w:val="1"/>
+        <w:rPr>
+          <w:rFonts w:ascii="Arial" w:eastAsia="ＭＳ Ｐゴシック" w:hAnsi="Arial" w:cs="Arial"/>
+          <w:b/>
+          <w:bCs/>
+          <w:kern w:val="0"/>
+          <w:sz w:val="36"/>
+          <w:szCs w:val="36"/>
+          <w14:ligatures w14:val="none"/>
+        </w:rPr>
+      </w:pPr>
+      <w:r>
+        <w:rPr>
+          <w:rFonts w:ascii="Arial" w:eastAsia="ＭＳ Ｐゴシック" w:hAnsi="Arial" w:cs="Arial"/>
+          <w:b/>
+          <w:bCs/>
+          <w:kern w:val="0"/>
+          <w:sz w:val="36"/>
+          <w:szCs w:val="36"/>
+          <w14:ligatures w14:val="none"/>
+        </w:rPr>
+        <w:t>8. Indemnification</w:t>
+      </w:r>
+    </w:p>
+    <w:p>
+      <w:pPr>
+        <w:widowControl/>
+        <w:numPr>
+          <w:ilvl w:val="0"/>
+          <w:numId w:val="10"/>
+        </w:numPr>
+        <w:spacing w:before="100" w:beforeAutospacing="1" w:after="100" w:afterAutospacing="1" w:line="240" w:lineRule="auto"/>
+        <w:rPr>
+          <w:rFonts w:ascii="Arial" w:eastAsia="ＭＳ Ｐゴシック" w:hAnsi="Arial" w:cs="Arial"/>
+          <w:kern w:val="0"/>
+          <w:sz w:val="24"/>
+          <w14:ligatures w14:val="none"/>
+        </w:rPr>
+      </w:pPr>
+      <w:r>
+        <w:rPr>
+          <w:rFonts w:ascii="Arial" w:eastAsia="ＭＳ Ｐゴシック" w:hAnsi="Arial" w:cs="Arial"/>
+          <w:kern w:val="0"/>
+          <w:sz w:val="24"/>
+          <w14:ligatures w14:val="none"/>
+        </w:rPr>
+        <w:t>The Developer's total liability under this agreement, including indemnification obligations, shall not exceed the total amount paid by the Client under this agreement.</w:t>
+      </w:r>
+    </w:p>
+    <w:p>
+      <w:pPr>
+        <w:widowControl/>
+        <w:numPr>
+          <w:ilvl w:val="0"/>
+          <w:numId w:val="10"/>
+        </w:numPr>
+        <w:spacing w:before="100" w:beforeAutospacing="1" w:after="100" w:afterAutospacing="1" w:line="240" w:lineRule="auto"/>
+        <w:rPr>
+          <w:rFonts w:ascii="Arial" w:eastAsia="ＭＳ Ｐゴシック" w:hAnsi="Arial" w:cs="Arial"/>
+          <w:kern w:val="0"/>
+          <w:sz w:val="24"/>
+          <w14:ligatures w14:val="none"/>
+        </w:rPr>
+      </w:pPr>
+      <w:r>
+        <w:rPr>
+          <w:rFonts w:ascii="Arial" w:eastAsia="ＭＳ Ｐゴシック" w:hAnsi="Arial" w:cs="Arial"/>
+          <w:kern w:val="0"/>
+          <w:sz w:val="24"/>
+          <w14:ligatures w14:val="none"/>
+        </w:rPr>
+        <w:t>The Developer agrees to indemnify and defend the Client against claims arising from intellectual property infringement or breach of warranty only in cases of gross negligence or willful misconduct by the Developer.</w:t>
+      </w:r>
+    </w:p>
+    <w:p>
+      <w:pPr>
+        <w:widowControl/>
+        <w:numPr>
+          <w:ilvl w:val="0"/>
+          <w:numId w:val="10"/>
+        </w:numPr>
+        <w:spacing w:before="100" w:beforeAutospacing="1" w:after="100" w:afterAutospacing="1" w:line="240" w:lineRule="auto"/>
+        <w:rPr>
+          <w:rFonts w:ascii="Arial" w:eastAsia="ＭＳ Ｐゴシック" w:hAnsi="Arial" w:cs="Arial"/>
+          <w:kern w:val="0"/>
+          <w:sz w:val="24"/>
+          <w14:ligatures w14:val="none"/>
+        </w:rPr>
+      </w:pPr>
+      <w:r>
+        <w:rPr>
+          <w:rFonts w:ascii="Arial" w:eastAsia="ＭＳ Ｐゴシック" w:hAnsi="Arial" w:cs="Arial"/>
+          <w:kern w:val="0"/>
+          <w:sz w:val="24"/>
+          <w14:ligatures w14:val="none"/>
+        </w:rPr>
+        <w:t>The Developer's indemnification obligations shall not apply to:</w:t>
+      </w:r>
+    </w:p>
+    <w:p>
+      <w:pPr>
+        <w:widowControl/>
+        <w:numPr>
+          <w:ilvl w:val="1"/>
+          <w:numId w:val="10"/>
+        </w:numPr>
+        <w:spacing w:before="100" w:beforeAutospacing="1" w:after="100" w:afterAutospacing="1" w:line="240" w:lineRule="auto"/>
+        <w:rPr>
+          <w:rFonts w:ascii="Arial" w:eastAsia="ＭＳ Ｐゴシック" w:hAnsi="Arial" w:cs="Arial"/>
+          <w:kern w:val="0"/>
+          <w:sz w:val="24"/>
+          <w14:ligatures w14:val="none"/>
+        </w:rPr>
+      </w:pPr>
+      <w:r>
+        <w:rPr>
+          <w:rFonts w:ascii="Arial" w:eastAsia="ＭＳ Ｐゴシック" w:hAnsi="Arial" w:cs="Arial"/>
+          <w:kern w:val="0"/>
+          <w:sz w:val="24"/>
+          <w14:ligatures w14:val="none"/>
+        </w:rPr>
+        <w:t>Modifications made by the Client,</w:t>
+      </w:r>
+    </w:p>
+    <w:p>
+      <w:pPr>
+        <w:widowControl/>
+        <w:numPr>
+          <w:ilvl w:val="1"/>
+          <w:numId w:val="10"/>
+        </w:numPr>
+        <w:spacing w:before="100" w:beforeAutospacing="1" w:after="100" w:afterAutospacing="1" w:line="240" w:lineRule="auto"/>
+        <w:rPr>
+          <w:rFonts w:ascii="Arial" w:eastAsia="ＭＳ Ｐゴシック" w:hAnsi="Arial" w:cs="Arial"/>
+          <w:kern w:val="0"/>
+          <w:sz w:val="24"/>
+          <w14:ligatures w14:val="none"/>
+        </w:rPr>
+      </w:pPr>
+      <w:r>
+        <w:rPr>
+          <w:rFonts w:ascii="Arial" w:eastAsia="ＭＳ Ｐゴシック" w:hAnsi="Arial" w:cs="Arial"/>
+          <w:kern w:val="0"/>
+          <w:sz w:val="24"/>
+          <w14:ligatures w14:val="none"/>
+        </w:rPr>
+        <w:t>Integration with third-party systems not specified in the original requirements, or</w:t>
+      </w:r>
+    </w:p>
+    <w:p>
+      <w:pPr>
+        <w:widowControl/>
+        <w:numPr>
+          <w:ilvl w:val="1"/>
+          <w:numId w:val="10"/>
+        </w:numPr>
+        <w:spacing w:before="100" w:beforeAutospacing="1" w:after="100" w:afterAutospacing="1" w:line="240" w:lineRule="auto"/>
+        <w:rPr>
+          <w:rFonts w:ascii="Arial" w:eastAsia="ＭＳ Ｐゴシック" w:hAnsi="Arial" w:cs="Arial"/>
+          <w:kern w:val="0"/>
+          <w:sz w:val="24"/>
+          <w14:ligatures w14:val="none"/>
+        </w:rPr>
+      </w:pPr>
+      <w:r>
+        <w:rPr>
+          <w:rFonts w:ascii="Arial" w:eastAsia="ＭＳ Ｐゴシック" w:hAnsi="Arial" w:cs="Arial"/>
+          <w:kern w:val="0"/>
+          <w:sz w:val="24"/>
+          <w14:ligatures w14:val="none"/>
+        </w:rPr>
+        <w:t>Use of the Software outside the intended scope.</w:t>
+      </w:r>
+    </w:p>
+    <w:p>
+      <w:pPr>
+        <w:widowControl/>
+        <w:spacing w:after="0" w:line="240" w:lineRule="auto"/>
+        <w:rPr>
+          <w:rFonts w:ascii="Arial" w:eastAsia="ＭＳ Ｐゴシック" w:hAnsi="Arial" w:cs="Arial"/>
+          <w:kern w:val="0"/>
+          <w:sz w:val="24"/>
+          <w14:ligatures w14:val="none"/>
+        </w:rPr>
+      </w:pPr>
+    </w:p>
+    <w:p>
+      <w:pPr>
+        <w:widowControl/>
+        <w:spacing w:before="100" w:beforeAutospacing="1" w:after="100" w:afterAutospacing="1" w:line="240" w:lineRule="auto"/>
+        <w:outlineLvl w:val="1"/>
+        <w:rPr>
+          <w:rFonts w:ascii="Arial" w:eastAsia="ＭＳ Ｐゴシック" w:hAnsi="Arial" w:cs="Arial"/>
+          <w:b/>
+          <w:bCs/>
+          <w:kern w:val="0"/>
+          <w:sz w:val="36"/>
+          <w:szCs w:val="36"/>
+          <w14:ligatures w14:val="none"/>
+        </w:rPr>
+      </w:pPr>
+      <w:r>
+        <w:rPr>
+          <w:rFonts w:ascii="Arial" w:eastAsia="ＭＳ Ｐゴシック" w:hAnsi="Arial" w:cs="Arial"/>
+          <w:b/>
+          <w:bCs/>
+          <w:kern w:val="0"/>
+          <w:sz w:val="36"/>
+          <w:szCs w:val="36"/>
+          <w14:ligatures w14:val="none"/>
+        </w:rPr>
+        <w:t>9. Modification</w:t>
+      </w:r>
+    </w:p>
+    <w:p>
+      <w:pPr>
+        <w:widowControl/>
+        <w:spacing w:before="100" w:beforeAutospacing="1" w:after="100" w:afterAutospacing="1" w:line="240" w:lineRule="auto"/>
+        <w:rPr>
+          <w:rFonts w:ascii="Arial" w:eastAsia="ＭＳ Ｐゴシック" w:hAnsi="Arial" w:cs="Arial"/>
+          <w:kern w:val="0"/>
+          <w:sz w:val="24"/>
+          <w14:ligatures w14:val="none"/>
+        </w:rPr>
+      </w:pPr>
+      <w:r>
+        <w:rPr>
+          <w:rFonts w:ascii="Arial" w:eastAsia="ＭＳ Ｐゴシック" w:hAnsi="Arial" w:cs="Arial"/>
+          <w:kern w:val="0"/>
+          <w:sz w:val="24"/>
+          <w14:ligatures w14:val="none"/>
+        </w:rPr>
+        <w:t>No modification of this Agreement shall be valid unless in writing and signed by both Parties.</w:t>
+      </w:r>
+    </w:p>
+    <w:p>
+      <w:pPr>
+        <w:widowControl/>
+        <w:spacing w:after="0" w:line="240" w:lineRule="auto"/>
+        <w:rPr>
+          <w:rFonts w:ascii="Arial" w:eastAsia="ＭＳ Ｐゴシック" w:hAnsi="Arial" w:cs="Arial"/>
+          <w:kern w:val="0"/>
+          <w:sz w:val="24"/>
+          <w14:ligatures w14:val="none"/>
+        </w:rPr>
+      </w:pPr>
+    </w:p>
+    <w:p>
+      <w:pPr>
+        <w:widowControl/>
+        <w:spacing w:before="100" w:beforeAutospacing="1" w:after="100" w:afterAutospacing="1" w:line="240" w:lineRule="auto"/>
+        <w:outlineLvl w:val="1"/>
+        <w:rPr>
+          <w:rFonts w:ascii="Arial" w:eastAsia="ＭＳ Ｐゴシック" w:hAnsi="Arial" w:cs="Arial"/>
+          <w:b/>
+          <w:bCs/>
+          <w:kern w:val="0"/>
+          <w:sz w:val="36"/>
+          <w:szCs w:val="36"/>
+          <w14:ligatures w14:val="none"/>
+        </w:rPr>
+      </w:pPr>
+      <w:r>
+        <w:rPr>
+          <w:rFonts w:ascii="Arial" w:eastAsia="ＭＳ Ｐゴシック" w:hAnsi="Arial" w:cs="Arial"/>
+          <w:b/>
+          <w:bCs/>
+          <w:kern w:val="0"/>
+          <w:sz w:val="36"/>
+          <w:szCs w:val="36"/>
+          <w14:ligatures w14:val="none"/>
+        </w:rPr>
+        <w:t>10. Governing Law</w:t>
+      </w:r>
+    </w:p>
+    <w:p>
+      <w:pPr>
+        <w:widowControl/>
+        <w:spacing w:before="100" w:beforeAutospacing="1" w:after="100" w:afterAutospacing="1" w:line="240" w:lineRule="auto"/>
+        <w:rPr>
+          <w:rFonts w:ascii="Arial" w:eastAsia="ＭＳ Ｐゴシック" w:hAnsi="Arial" w:cs="Arial"/>
+          <w:kern w:val="0"/>
+          <w:sz w:val="24"/>
+          <w14:ligatures w14:val="none"/>
+        </w:rPr>
+      </w:pPr>
+      <w:r>
+        <w:rPr>
+          <w:rFonts w:ascii="Arial" w:eastAsia="ＭＳ Ｐゴシック" w:hAnsi="Arial" w:cs="Arial"/>
+          <w:kern w:val="0"/>
+          <w:sz w:val="24"/>
+          <w14:ligatures w14:val="none"/>
+        </w:rPr>
+        <w:t>The governing law and jurisdiction for this Software Development Agreement and the interpretation of its terms shall be determined through mutual consultation and agreement between the parties.</w:t>
       </w:r>
     </w:p>
     <w:p>
@@ -426,9 +1887,12 @@
           <w14:ligatures w14:val="none"/>
         </w:rPr>
       </w:pPr>
-      <w:r>
-        <w:rPr>
-          <w:rFonts w:ascii="Arial" w:eastAsia="ＭＳ Ｐゴシック" w:hAnsi="Arial" w:cs="Arial"/>
+    </w:p>
+    <w:p>
+      <w:pPr>
+        <w:widowControl/>
+        <w:rPr>
+          <w:rFonts w:ascii="Arial" w:eastAsia="ＭＳ Ｐゴシック" w:hAnsi="Arial" w:cs="Arial" w:hint="eastAsia"/>
           <w:b/>
           <w:bCs/>
           <w:kern w:val="0"/>
@@ -436,341 +1900,8 @@
           <w:szCs w:val="27"/>
           <w14:ligatures w14:val="none"/>
         </w:rPr>
-        <w:t>1. Developer's Duties</w:t>
-      </w:r>
-    </w:p>
-    <w:p>
-      <w:pPr>
-        <w:widowControl/>
-        <w:numPr>
-          <w:ilvl w:val="0"/>
-          <w:numId w:val="1"/>
-        </w:numPr>
-        <w:spacing w:before="100" w:beforeAutospacing="1" w:after="100" w:afterAutospacing="1" w:line="240" w:lineRule="auto"/>
-        <w:rPr>
-          <w:rFonts w:ascii="Arial" w:eastAsia="ＭＳ Ｐゴシック" w:hAnsi="Arial" w:cs="Arial"/>
-          <w:kern w:val="0"/>
-          <w:sz w:val="24"/>
-          <w14:ligatures w14:val="none"/>
-        </w:rPr>
-      </w:pPr>
-      <w:r>
-        <w:rPr>
-          <w:rFonts w:ascii="Arial" w:eastAsia="ＭＳ Ｐゴシック" w:hAnsi="Arial" w:cs="Arial"/>
-          <w:kern w:val="0"/>
-          <w:sz w:val="24"/>
-          <w14:ligatures w14:val="none"/>
-        </w:rPr>
-        <w:t xml:space="preserve">The Client hereby engages the </w:t>
-      </w:r>
-      <w:proofErr w:type="gramStart"/>
-      <w:r>
-        <w:rPr>
-          <w:rFonts w:ascii="Arial" w:eastAsia="ＭＳ Ｐゴシック" w:hAnsi="Arial" w:cs="Arial"/>
-          <w:kern w:val="0"/>
-          <w:sz w:val="24"/>
-          <w14:ligatures w14:val="none"/>
-        </w:rPr>
-        <w:t>Developer</w:t>
-      </w:r>
-      <w:proofErr w:type="gramEnd"/>
-      <w:r>
-        <w:rPr>
-          <w:rFonts w:ascii="Arial" w:eastAsia="ＭＳ Ｐゴシック" w:hAnsi="Arial" w:cs="Arial"/>
-          <w:kern w:val="0"/>
-          <w:sz w:val="24"/>
-          <w14:ligatures w14:val="none"/>
-        </w:rPr>
-        <w:t xml:space="preserve"> and the Developer hereby agrees to be engaged by the Client to develop the Software in accordance with the specifications.</w:t>
-      </w:r>
-    </w:p>
-    <w:p>
-      <w:pPr>
-        <w:widowControl/>
-        <w:numPr>
-          <w:ilvl w:val="0"/>
-          <w:numId w:val="1"/>
-        </w:numPr>
-        <w:spacing w:before="100" w:beforeAutospacing="1" w:after="100" w:afterAutospacing="1" w:line="240" w:lineRule="auto"/>
-        <w:rPr>
-          <w:rFonts w:ascii="Arial" w:eastAsia="ＭＳ Ｐゴシック" w:hAnsi="Arial" w:cs="Arial"/>
-          <w:kern w:val="0"/>
-          <w:sz w:val="24"/>
-          <w14:ligatures w14:val="none"/>
-        </w:rPr>
-      </w:pPr>
-      <w:r>
-        <w:rPr>
-          <w:rFonts w:ascii="Arial" w:eastAsia="ＭＳ Ｐゴシック" w:hAnsi="Arial" w:cs="Arial"/>
-          <w:kern w:val="0"/>
-          <w:sz w:val="24"/>
-          <w14:ligatures w14:val="none"/>
-        </w:rPr>
-        <w:t xml:space="preserve">The Developer shall complete the development of the Software. The final product shall be delivered to the Client by </w:t>
-      </w:r>
-      <w:r>
-        <w:rPr>
-          <w:rFonts w:ascii="Arial" w:eastAsia="ＭＳ Ｐゴシック" w:hAnsi="Arial" w:cs="Arial"/>
-          <w:b/>
-          <w:bCs/>
-          <w:color w:val="EE0000"/>
-          <w:kern w:val="0"/>
-          <w:sz w:val="24"/>
-          <w14:ligatures w14:val="none"/>
-        </w:rPr>
-        <w:t>05</w:t>
-      </w:r>
-      <w:r>
-        <w:rPr>
-          <w:rFonts w:ascii="Arial" w:eastAsia="ＭＳ Ｐゴシック" w:hAnsi="Arial" w:cs="Arial"/>
-          <w:b/>
-          <w:bCs/>
-          <w:color w:val="EE0000"/>
-          <w:kern w:val="0"/>
-          <w:sz w:val="24"/>
-          <w14:ligatures w14:val="none"/>
-        </w:rPr>
-        <w:t xml:space="preserve"> </w:t>
-      </w:r>
-      <w:r>
-        <w:rPr>
-          <w:rFonts w:ascii="Arial" w:eastAsia="ＭＳ Ｐゴシック" w:hAnsi="Arial" w:cs="Arial"/>
-          <w:b/>
-          <w:bCs/>
-          <w:color w:val="EE0000"/>
-          <w:kern w:val="0"/>
-          <w:sz w:val="24"/>
-          <w14:ligatures w14:val="none"/>
-        </w:rPr>
-        <w:t>December</w:t>
-      </w:r>
-      <w:r>
-        <w:rPr>
-          <w:rFonts w:ascii="Arial" w:eastAsia="ＭＳ Ｐゴシック" w:hAnsi="Arial" w:cs="Arial"/>
-          <w:b/>
-          <w:bCs/>
-          <w:color w:val="EE0000"/>
-          <w:kern w:val="0"/>
-          <w:sz w:val="24"/>
-          <w14:ligatures w14:val="none"/>
-        </w:rPr>
-        <w:t xml:space="preserve"> </w:t>
-      </w:r>
-      <w:r>
-        <w:rPr>
-          <w:rFonts w:ascii="Arial" w:eastAsia="ＭＳ Ｐゴシック" w:hAnsi="Arial" w:cs="Arial"/>
-          <w:b/>
-          <w:bCs/>
-          <w:color w:val="EE0000"/>
-          <w:kern w:val="0"/>
-          <w:sz w:val="24"/>
-          <w14:ligatures w14:val="none"/>
-        </w:rPr>
-        <w:t>2025</w:t>
-      </w:r>
-      <w:r>
-        <w:rPr>
-          <w:rFonts w:ascii="Arial" w:eastAsia="ＭＳ Ｐゴシック" w:hAnsi="Arial" w:cs="Arial"/>
-          <w:kern w:val="0"/>
-          <w:sz w:val="24"/>
-          <w14:ligatures w14:val="none"/>
-        </w:rPr>
-        <w:t>.</w:t>
-      </w:r>
-    </w:p>
-    <w:p>
-      <w:pPr>
-        <w:widowControl/>
-        <w:numPr>
-          <w:ilvl w:val="0"/>
-          <w:numId w:val="1"/>
-        </w:numPr>
-        <w:spacing w:before="100" w:beforeAutospacing="1" w:after="100" w:afterAutospacing="1" w:line="240" w:lineRule="auto"/>
-        <w:rPr>
-          <w:rFonts w:ascii="Arial" w:eastAsia="ＭＳ Ｐゴシック" w:hAnsi="Arial" w:cs="Arial"/>
-          <w:kern w:val="0"/>
-          <w:sz w:val="24"/>
-          <w14:ligatures w14:val="none"/>
-        </w:rPr>
-      </w:pPr>
-      <w:r>
-        <w:rPr>
-          <w:rFonts w:ascii="Arial" w:eastAsia="ＭＳ Ｐゴシック" w:hAnsi="Arial" w:cs="Arial"/>
-          <w:kern w:val="0"/>
-          <w:sz w:val="24"/>
-          <w14:ligatures w14:val="none"/>
-        </w:rPr>
-        <w:t xml:space="preserve">For a period </w:t>
-      </w:r>
-      <w:r>
-        <w:rPr>
-          <w:rFonts w:ascii="Arial" w:eastAsia="ＭＳ Ｐゴシック" w:hAnsi="Arial" w:cs="Arial"/>
-          <w:b/>
-          <w:bCs/>
-          <w:color w:val="EE0000"/>
-          <w:kern w:val="0"/>
-          <w:sz w:val="24"/>
-          <w14:ligatures w14:val="none"/>
-        </w:rPr>
-        <w:t>180 days of development</w:t>
-      </w:r>
-      <w:r>
-        <w:rPr>
-          <w:rFonts w:ascii="Arial" w:eastAsia="ＭＳ Ｐゴシック" w:hAnsi="Arial" w:cs="Arial" w:hint="eastAsia"/>
-          <w:color w:val="EE0000"/>
-          <w:kern w:val="0"/>
-          <w:sz w:val="24"/>
-          <w14:ligatures w14:val="none"/>
-        </w:rPr>
-        <w:t xml:space="preserve"> </w:t>
-      </w:r>
-      <w:r>
-        <w:rPr>
-          <w:rFonts w:ascii="Arial" w:eastAsia="ＭＳ Ｐゴシック" w:hAnsi="Arial" w:cs="Arial"/>
-          <w:kern w:val="0"/>
-          <w:sz w:val="24"/>
-          <w14:ligatures w14:val="none"/>
-        </w:rPr>
-        <w:t xml:space="preserve">after delivery of the final product, the Developer shall provide the Client assistance in answering questions or resolving issues strictly within the scope of the specification described in </w:t>
-      </w:r>
-      <w:r>
-        <w:rPr>
-          <w:rFonts w:ascii="Arial" w:eastAsia="ＭＳ Ｐゴシック" w:hAnsi="Arial" w:cs="Arial"/>
-          <w:color w:val="EE0000"/>
-          <w:kern w:val="0"/>
-          <w:sz w:val="24"/>
-          <w14:ligatures w14:val="none"/>
-        </w:rPr>
-        <w:t>Exhibit A</w:t>
-      </w:r>
-      <w:r>
-        <w:rPr>
-          <w:rFonts w:ascii="Arial" w:eastAsia="ＭＳ Ｐゴシック" w:hAnsi="Arial" w:cs="Arial"/>
-          <w:kern w:val="0"/>
-          <w:sz w:val="24"/>
-          <w14:ligatures w14:val="none"/>
-        </w:rPr>
-        <w:t>.</w:t>
-      </w:r>
-    </w:p>
-    <w:p>
-      <w:pPr>
-        <w:widowControl/>
-        <w:numPr>
-          <w:ilvl w:val="0"/>
-          <w:numId w:val="1"/>
-        </w:numPr>
-        <w:spacing w:before="100" w:beforeAutospacing="1" w:after="100" w:afterAutospacing="1" w:line="240" w:lineRule="auto"/>
-        <w:rPr>
-          <w:rFonts w:ascii="Arial" w:eastAsia="ＭＳ Ｐゴシック" w:hAnsi="Arial" w:cs="Arial"/>
-          <w:kern w:val="0"/>
-          <w:sz w:val="24"/>
-          <w14:ligatures w14:val="none"/>
-        </w:rPr>
-      </w:pPr>
-      <w:r>
-        <w:rPr>
-          <w:rFonts w:ascii="Arial" w:eastAsia="ＭＳ Ｐゴシック" w:hAnsi="Arial" w:cs="Arial"/>
-          <w:kern w:val="0"/>
-          <w:sz w:val="24"/>
-          <w14:ligatures w14:val="none"/>
-        </w:rPr>
-        <w:t xml:space="preserve">The Client may terminate this Software Development Agreement at any time upon material breach of the terms herein and failure to cure such breach within </w:t>
-      </w:r>
-      <w:r>
-        <w:rPr>
-          <w:rFonts w:ascii="Arial" w:eastAsia="ＭＳ Ｐゴシック" w:hAnsi="Arial" w:cs="Arial"/>
-          <w:b/>
-          <w:bCs/>
-          <w:kern w:val="0"/>
-          <w:sz w:val="24"/>
-          <w14:ligatures w14:val="none"/>
-        </w:rPr>
-        <w:t>180 days</w:t>
-      </w:r>
-      <w:r>
-        <w:rPr>
-          <w:rFonts w:ascii="Arial" w:eastAsia="ＭＳ Ｐゴシック" w:hAnsi="Arial" w:cs="Arial"/>
-          <w:b/>
-          <w:bCs/>
-          <w:kern w:val="0"/>
-          <w:sz w:val="24"/>
-          <w14:ligatures w14:val="none"/>
-        </w:rPr>
-        <w:t xml:space="preserve"> </w:t>
-      </w:r>
-      <w:r>
-        <w:rPr>
-          <w:rFonts w:ascii="Arial" w:eastAsia="ＭＳ Ｐゴシック" w:hAnsi="Arial" w:cs="Arial"/>
-          <w:kern w:val="0"/>
-          <w:sz w:val="24"/>
-          <w14:ligatures w14:val="none"/>
-        </w:rPr>
-        <w:t>of notification.</w:t>
-      </w:r>
-    </w:p>
-    <w:p>
-      <w:pPr>
-        <w:widowControl/>
-        <w:numPr>
-          <w:ilvl w:val="0"/>
-          <w:numId w:val="1"/>
-        </w:numPr>
-        <w:spacing w:before="100" w:beforeAutospacing="1" w:after="100" w:afterAutospacing="1" w:line="240" w:lineRule="auto"/>
-        <w:rPr>
-          <w:rFonts w:ascii="Arial" w:eastAsia="ＭＳ Ｐゴシック" w:hAnsi="Arial" w:cs="Arial"/>
-          <w:kern w:val="0"/>
-          <w:sz w:val="24"/>
-          <w14:ligatures w14:val="none"/>
-        </w:rPr>
-      </w:pPr>
-      <w:r>
-        <w:rPr>
-          <w:rFonts w:ascii="Arial" w:eastAsia="ＭＳ Ｐゴシック" w:hAnsi="Arial" w:cs="Arial"/>
-          <w:kern w:val="0"/>
-          <w:sz w:val="24"/>
-          <w14:ligatures w14:val="none"/>
-        </w:rPr>
-        <w:t xml:space="preserve">The Developer shall provide the Client, if requested, a cumulative </w:t>
-      </w:r>
-      <w:r>
-        <w:rPr>
-          <w:rFonts w:ascii="Arial" w:eastAsia="ＭＳ Ｐゴシック" w:hAnsi="Arial" w:cs="Arial"/>
-          <w:b/>
-          <w:bCs/>
-          <w:kern w:val="0"/>
-          <w:sz w:val="24"/>
-          <w14:ligatures w14:val="none"/>
-        </w:rPr>
-        <w:t>180 days</w:t>
-      </w:r>
-      <w:r>
-        <w:rPr>
-          <w:rFonts w:ascii="Arial" w:eastAsia="ＭＳ Ｐゴシック" w:hAnsi="Arial" w:cs="Arial"/>
-          <w:kern w:val="0"/>
-          <w:sz w:val="24"/>
-          <w14:ligatures w14:val="none"/>
-        </w:rPr>
-        <w:t xml:space="preserve"> of training regarding the operation and integration of the QR code payment feature after the Delivery Date.</w:t>
-      </w:r>
-    </w:p>
-    <w:p>
-      <w:pPr>
-        <w:widowControl/>
-        <w:spacing w:before="100" w:beforeAutospacing="1" w:after="100" w:afterAutospacing="1" w:line="240" w:lineRule="auto"/>
-        <w:rPr>
-          <w:rFonts w:ascii="Arial" w:eastAsia="ＭＳ Ｐゴシック" w:hAnsi="Arial" w:cs="Arial"/>
-          <w:kern w:val="0"/>
-          <w:sz w:val="24"/>
-          <w14:ligatures w14:val="none"/>
-        </w:rPr>
-      </w:pPr>
-    </w:p>
-    <w:p>
-      <w:pPr>
-        <w:widowControl/>
-        <w:spacing w:before="100" w:beforeAutospacing="1" w:after="100" w:afterAutospacing="1" w:line="240" w:lineRule="auto"/>
-        <w:outlineLvl w:val="2"/>
+      </w:pPr>
+      <w:r>
         <w:rPr>
           <w:rFonts w:ascii="Arial" w:eastAsia="ＭＳ Ｐゴシック" w:hAnsi="Arial" w:cs="Arial"/>
           <w:b/>
@@ -780,134 +1911,7 @@
           <w:szCs w:val="27"/>
           <w14:ligatures w14:val="none"/>
         </w:rPr>
-      </w:pPr>
-      <w:r>
-        <w:rPr>
-          <w:rFonts w:ascii="Arial" w:eastAsia="ＭＳ Ｐゴシック" w:hAnsi="Arial" w:cs="Arial"/>
-          <w:b/>
-          <w:bCs/>
-          <w:kern w:val="0"/>
-          <w:sz w:val="27"/>
-          <w:szCs w:val="27"/>
-          <w14:ligatures w14:val="none"/>
-        </w:rPr>
-        <w:lastRenderedPageBreak/>
-        <w:t>2. Delivery</w:t>
-      </w:r>
-    </w:p>
-    <w:p>
-      <w:pPr>
-        <w:widowControl/>
-        <w:numPr>
-          <w:ilvl w:val="0"/>
-          <w:numId w:val="2"/>
-        </w:numPr>
-        <w:spacing w:before="100" w:beforeAutospacing="1" w:after="100" w:afterAutospacing="1" w:line="240" w:lineRule="auto"/>
-        <w:rPr>
-          <w:rFonts w:ascii="Arial" w:eastAsia="ＭＳ Ｐゴシック" w:hAnsi="Arial" w:cs="Arial"/>
-          <w:kern w:val="0"/>
-          <w:sz w:val="24"/>
-          <w14:ligatures w14:val="none"/>
-        </w:rPr>
-      </w:pPr>
-      <w:r>
-        <w:rPr>
-          <w:rFonts w:ascii="Arial" w:eastAsia="ＭＳ Ｐゴシック" w:hAnsi="Arial" w:cs="Arial"/>
-          <w:kern w:val="0"/>
-          <w:sz w:val="24"/>
-          <w14:ligatures w14:val="none"/>
-        </w:rPr>
-        <w:t>The Software shall function in accordance with the Specifications on or before the Delivery Date.</w:t>
-      </w:r>
-    </w:p>
-    <w:p>
-      <w:pPr>
-        <w:widowControl/>
-        <w:numPr>
-          <w:ilvl w:val="0"/>
-          <w:numId w:val="2"/>
-        </w:numPr>
-        <w:spacing w:before="100" w:beforeAutospacing="1" w:after="100" w:afterAutospacing="1" w:line="240" w:lineRule="auto"/>
-        <w:rPr>
-          <w:rFonts w:ascii="Arial" w:eastAsia="ＭＳ Ｐゴシック" w:hAnsi="Arial" w:cs="Arial"/>
-          <w:kern w:val="0"/>
-          <w:sz w:val="24"/>
-          <w14:ligatures w14:val="none"/>
-        </w:rPr>
-      </w:pPr>
-      <w:r>
-        <w:rPr>
-          <w:rFonts w:ascii="Arial" w:eastAsia="ＭＳ Ｐゴシック" w:hAnsi="Arial" w:cs="Arial"/>
-          <w:kern w:val="0"/>
-          <w:sz w:val="24"/>
-          <w14:ligatures w14:val="none"/>
-        </w:rPr>
-        <w:t xml:space="preserve">If the delivered Software does not conform to the Specifications, the Client shall notify the Developer within </w:t>
-      </w:r>
-      <w:r>
-        <w:rPr>
-          <w:rFonts w:ascii="Arial" w:eastAsia="ＭＳ Ｐゴシック" w:hAnsi="Arial" w:cs="Arial"/>
-          <w:b/>
-          <w:bCs/>
-          <w:kern w:val="0"/>
-          <w:sz w:val="24"/>
-          <w14:ligatures w14:val="none"/>
-        </w:rPr>
-        <w:t>180 days</w:t>
-      </w:r>
-      <w:r>
-        <w:rPr>
-          <w:rFonts w:ascii="Arial" w:eastAsia="ＭＳ Ｐゴシック" w:hAnsi="Arial" w:cs="Arial"/>
-          <w:kern w:val="0"/>
-          <w:sz w:val="24"/>
-          <w14:ligatures w14:val="none"/>
-        </w:rPr>
-        <w:t xml:space="preserve"> of the Delivery Date with a written description of the issues. The Developer agrees to make reasonable efforts to correct any non-conformity.</w:t>
-      </w:r>
-    </w:p>
-    <w:p>
-      <w:pPr>
-        <w:widowControl/>
-        <w:numPr>
-          <w:ilvl w:val="0"/>
-          <w:numId w:val="2"/>
-        </w:numPr>
-        <w:spacing w:before="100" w:beforeAutospacing="1" w:after="100" w:afterAutospacing="1" w:line="240" w:lineRule="auto"/>
-        <w:rPr>
-          <w:rFonts w:ascii="Arial" w:eastAsia="ＭＳ Ｐゴシック" w:hAnsi="Arial" w:cs="Arial"/>
-          <w:kern w:val="0"/>
-          <w:sz w:val="24"/>
-          <w14:ligatures w14:val="none"/>
-        </w:rPr>
-      </w:pPr>
-      <w:r>
-        <w:rPr>
-          <w:rFonts w:ascii="Arial" w:eastAsia="ＭＳ Ｐゴシック" w:hAnsi="Arial" w:cs="Arial"/>
-          <w:kern w:val="0"/>
-          <w:sz w:val="24"/>
-          <w14:ligatures w14:val="none"/>
-        </w:rPr>
-        <w:t xml:space="preserve">The Client shall provide a written notice of acceptance (or rejection) based on conformity to the Specifications within </w:t>
-      </w:r>
-      <w:r>
-        <w:rPr>
-          <w:rFonts w:ascii="Arial" w:eastAsia="ＭＳ Ｐゴシック" w:hAnsi="Arial" w:cs="Arial"/>
-          <w:b/>
-          <w:bCs/>
-          <w:kern w:val="0"/>
-          <w:sz w:val="24"/>
-          <w14:ligatures w14:val="none"/>
-        </w:rPr>
-        <w:t>180 days</w:t>
-      </w:r>
-      <w:r>
-        <w:rPr>
-          <w:rFonts w:ascii="Arial" w:eastAsia="ＭＳ Ｐゴシック" w:hAnsi="Arial" w:cs="Arial"/>
-          <w:kern w:val="0"/>
-          <w:sz w:val="24"/>
-          <w14:ligatures w14:val="none"/>
-        </w:rPr>
-        <w:t xml:space="preserve"> of the Delivery Date.</w:t>
+        <w:br w:type="page"/>
       </w:r>
     </w:p>
     <w:p>
@@ -916,708 +1920,7 @@
         <w:spacing w:before="100" w:beforeAutospacing="1" w:after="100" w:afterAutospacing="1" w:line="240" w:lineRule="auto"/>
         <w:outlineLvl w:val="2"/>
         <w:rPr>
-          <w:rFonts w:ascii="Arial" w:eastAsia="ＭＳ Ｐゴシック" w:hAnsi="Arial" w:cs="Arial"/>
-          <w:b/>
-          <w:bCs/>
-          <w:kern w:val="0"/>
-          <w:sz w:val="27"/>
-          <w:szCs w:val="27"/>
-          <w14:ligatures w14:val="none"/>
-        </w:rPr>
-      </w:pPr>
-      <w:r>
-        <w:rPr>
-          <w:rFonts w:ascii="Arial" w:eastAsia="ＭＳ Ｐゴシック" w:hAnsi="Arial" w:cs="Arial"/>
-          <w:b/>
-          <w:bCs/>
-          <w:kern w:val="0"/>
-          <w:sz w:val="27"/>
-          <w:szCs w:val="27"/>
-          <w14:ligatures w14:val="none"/>
-        </w:rPr>
-        <w:t>3. Compensation</w:t>
-      </w:r>
-    </w:p>
-    <w:p>
-      <w:pPr>
-        <w:widowControl/>
-        <w:spacing w:before="100" w:beforeAutospacing="1" w:after="100" w:afterAutospacing="1" w:line="240" w:lineRule="auto"/>
-        <w:rPr>
-          <w:rFonts w:ascii="Arial" w:eastAsia="ＭＳ Ｐゴシック" w:hAnsi="Arial" w:cs="Arial"/>
-          <w:kern w:val="0"/>
-          <w:sz w:val="24"/>
-          <w14:ligatures w14:val="none"/>
-        </w:rPr>
-      </w:pPr>
-      <w:r>
-        <w:rPr>
-          <w:rFonts w:ascii="Arial" w:hAnsi="Arial" w:cs="Arial"/>
-        </w:rPr>
-        <w:t xml:space="preserve">The Client shall pay the Developer for the services as per the development phases described in </w:t>
-      </w:r>
-      <w:r>
-        <w:rPr>
-          <w:rFonts w:ascii="Arial" w:hAnsi="Arial" w:cs="Arial"/>
-          <w:color w:val="EE0000"/>
-        </w:rPr>
-        <w:t>Exhibit B</w:t>
-      </w:r>
-      <w:r>
-        <w:rPr>
-          <w:rFonts w:ascii="Arial" w:hAnsi="Arial" w:cs="Arial"/>
-        </w:rPr>
-        <w:t>. Payment amounts and timelines are detailed therein.</w:t>
-      </w:r>
-      <w:r>
-        <w:rPr>
-          <w:rFonts w:ascii="Arial" w:hAnsi="Arial" w:cs="Arial"/>
-        </w:rPr>
-        <w:br/>
-      </w:r>
-      <w:r>
-        <w:rPr>
-          <w:rStyle w:val="aa"/>
-          <w:rFonts w:ascii="Arial" w:hAnsi="Arial" w:cs="Arial"/>
-          <w:b w:val="0"/>
-          <w:bCs w:val="0"/>
-        </w:rPr>
-        <w:t xml:space="preserve">The dates listed in </w:t>
-      </w:r>
-      <w:r>
-        <w:rPr>
-          <w:rStyle w:val="aa"/>
-          <w:rFonts w:ascii="Arial" w:hAnsi="Arial" w:cs="Arial"/>
-          <w:b w:val="0"/>
-          <w:bCs w:val="0"/>
-          <w:color w:val="EE0000"/>
-        </w:rPr>
-        <w:t>Exhibit B</w:t>
-      </w:r>
-      <w:r>
-        <w:rPr>
-          <w:rStyle w:val="aa"/>
-          <w:rFonts w:ascii="Arial" w:hAnsi="Arial" w:cs="Arial"/>
-          <w:b w:val="0"/>
-          <w:bCs w:val="0"/>
-        </w:rPr>
-        <w:t xml:space="preserve"> for each development phase are for reference only. The Developer will provide advance notice (approximately two weeks prior) and inform the Client of the actual delivery dates based on the progress of development.</w:t>
-      </w:r>
-    </w:p>
-    <w:p>
-      <w:pPr>
-        <w:widowControl/>
-        <w:spacing w:before="100" w:beforeAutospacing="1" w:after="100" w:afterAutospacing="1" w:line="240" w:lineRule="auto"/>
-        <w:outlineLvl w:val="2"/>
-        <w:rPr>
-          <w:rFonts w:ascii="Arial" w:eastAsia="ＭＳ Ｐゴシック" w:hAnsi="Arial" w:cs="Arial"/>
-          <w:b/>
-          <w:bCs/>
-          <w:kern w:val="0"/>
-          <w:sz w:val="27"/>
-          <w:szCs w:val="27"/>
-          <w14:ligatures w14:val="none"/>
-        </w:rPr>
-      </w:pPr>
-      <w:r>
-        <w:rPr>
-          <w:rFonts w:ascii="Arial" w:eastAsia="ＭＳ Ｐゴシック" w:hAnsi="Arial" w:cs="Arial"/>
-          <w:b/>
-          <w:bCs/>
-          <w:kern w:val="0"/>
-          <w:sz w:val="27"/>
-          <w:szCs w:val="27"/>
-          <w14:ligatures w14:val="none"/>
-        </w:rPr>
-        <w:t>4. Intellectual Property Rights</w:t>
-      </w:r>
-    </w:p>
-    <w:p>
-      <w:pPr>
-        <w:widowControl/>
-        <w:spacing w:before="100" w:beforeAutospacing="1" w:after="100" w:afterAutospacing="1" w:line="240" w:lineRule="auto"/>
-        <w:rPr>
-          <w:rFonts w:ascii="Arial" w:eastAsia="ＭＳ Ｐゴシック" w:hAnsi="Arial" w:cs="Arial"/>
-          <w:kern w:val="0"/>
-          <w:sz w:val="24"/>
-          <w14:ligatures w14:val="none"/>
-        </w:rPr>
-      </w:pPr>
-      <w:r>
-        <w:rPr>
-          <w:rFonts w:ascii="Arial" w:eastAsia="ＭＳ Ｐゴシック" w:hAnsi="Arial" w:cs="Arial"/>
-          <w:kern w:val="0"/>
-          <w:sz w:val="24"/>
-          <w14:ligatures w14:val="none"/>
-        </w:rPr>
-        <w:t>All intellectual property rights related to the QR code payment feature, including but not limited to source code and documentation, shall be solely owned by the Client. The Developer waives any rights to claim ownership.</w:t>
-      </w:r>
-    </w:p>
-    <w:p>
-      <w:pPr>
-        <w:widowControl/>
-        <w:spacing w:before="100" w:beforeAutospacing="1" w:after="100" w:afterAutospacing="1" w:line="240" w:lineRule="auto"/>
-        <w:outlineLvl w:val="2"/>
-        <w:rPr>
-          <w:rFonts w:ascii="Arial" w:eastAsia="ＭＳ Ｐゴシック" w:hAnsi="Arial" w:cs="Arial"/>
-          <w:b/>
-          <w:bCs/>
-          <w:kern w:val="0"/>
-          <w:sz w:val="27"/>
-          <w:szCs w:val="27"/>
-          <w14:ligatures w14:val="none"/>
-        </w:rPr>
-      </w:pPr>
-      <w:r>
-        <w:rPr>
-          <w:rFonts w:ascii="Arial" w:eastAsia="ＭＳ Ｐゴシック" w:hAnsi="Arial" w:cs="Arial"/>
-          <w:b/>
-          <w:bCs/>
-          <w:kern w:val="0"/>
-          <w:sz w:val="27"/>
-          <w:szCs w:val="27"/>
-          <w14:ligatures w14:val="none"/>
-        </w:rPr>
-        <w:t>5. Change in Specifications</w:t>
-      </w:r>
-    </w:p>
-    <w:p>
-      <w:pPr>
-        <w:widowControl/>
-        <w:spacing w:before="100" w:beforeAutospacing="1" w:after="100" w:afterAutospacing="1" w:line="240" w:lineRule="auto"/>
-        <w:rPr>
-          <w:rFonts w:ascii="Arial" w:eastAsia="ＭＳ Ｐゴシック" w:hAnsi="Arial" w:cs="Arial"/>
-          <w:kern w:val="0"/>
-          <w:sz w:val="24"/>
-          <w14:ligatures w14:val="none"/>
-        </w:rPr>
-      </w:pPr>
-      <w:r>
-        <w:rPr>
-          <w:rFonts w:ascii="Arial" w:eastAsia="ＭＳ Ｐゴシック" w:hAnsi="Arial" w:cs="Arial"/>
-          <w:kern w:val="0"/>
-          <w:sz w:val="24"/>
-          <w14:ligatures w14:val="none"/>
-        </w:rPr>
-        <w:t>Reasonable change requests may be made by the Client. If such changes require additional effort or may cause delay, the Developer shall inform the Client and await approval to proceed with the changes under adjusted timelines and/or additional compensation. The Developer's judgment regarding delay or cost implications shall be respected.</w:t>
-      </w:r>
-    </w:p>
-    <w:p>
-      <w:pPr>
-        <w:widowControl/>
-        <w:spacing w:before="100" w:beforeAutospacing="1" w:after="100" w:afterAutospacing="1" w:line="240" w:lineRule="auto"/>
-        <w:outlineLvl w:val="2"/>
-        <w:rPr>
-          <w:rFonts w:ascii="Arial" w:eastAsia="ＭＳ Ｐゴシック" w:hAnsi="Arial" w:cs="Arial"/>
-          <w:b/>
-          <w:bCs/>
-          <w:kern w:val="0"/>
-          <w:sz w:val="27"/>
-          <w:szCs w:val="27"/>
-          <w14:ligatures w14:val="none"/>
-        </w:rPr>
-      </w:pPr>
-      <w:r>
-        <w:rPr>
-          <w:rFonts w:ascii="Arial" w:eastAsia="ＭＳ Ｐゴシック" w:hAnsi="Arial" w:cs="Arial"/>
-          <w:b/>
-          <w:bCs/>
-          <w:kern w:val="0"/>
-          <w:sz w:val="27"/>
-          <w:szCs w:val="27"/>
-          <w14:ligatures w14:val="none"/>
-        </w:rPr>
-        <w:t>6. Confidentiality</w:t>
-      </w:r>
-    </w:p>
-    <w:p>
-      <w:pPr>
-        <w:widowControl/>
-        <w:spacing w:before="100" w:beforeAutospacing="1" w:after="100" w:afterAutospacing="1" w:line="240" w:lineRule="auto"/>
-        <w:rPr>
-          <w:rFonts w:ascii="Arial" w:eastAsia="ＭＳ Ｐゴシック" w:hAnsi="Arial" w:cs="Arial"/>
-          <w:kern w:val="0"/>
-          <w:sz w:val="24"/>
-          <w14:ligatures w14:val="none"/>
-        </w:rPr>
-      </w:pPr>
-      <w:r>
-        <w:rPr>
-          <w:rFonts w:ascii="Arial" w:eastAsia="ＭＳ Ｐゴシック" w:hAnsi="Arial" w:cs="Arial"/>
-          <w:kern w:val="0"/>
-          <w:sz w:val="24"/>
-          <w14:ligatures w14:val="none"/>
-        </w:rPr>
-        <w:t xml:space="preserve">The Developer agrees to maintain strict confidentiality regarding all business and technical information (including specifications, source code, and business </w:t>
-      </w:r>
-      <w:r>
-        <w:rPr>
-          <w:rFonts w:ascii="Arial" w:eastAsia="ＭＳ Ｐゴシック" w:hAnsi="Arial" w:cs="Arial"/>
-          <w:kern w:val="0"/>
-          <w:sz w:val="24"/>
-          <w14:ligatures w14:val="none"/>
-        </w:rPr>
-        <w:lastRenderedPageBreak/>
-        <w:t>plans) obtained from the Client. No unauthorized use, disclosure, or duplication of confidential information is permitted.</w:t>
-      </w:r>
-    </w:p>
-    <w:p>
-      <w:pPr>
-        <w:widowControl/>
-        <w:spacing w:before="100" w:beforeAutospacing="1" w:after="100" w:afterAutospacing="1" w:line="240" w:lineRule="auto"/>
-        <w:outlineLvl w:val="2"/>
-        <w:rPr>
-          <w:rFonts w:ascii="Arial" w:eastAsia="ＭＳ Ｐゴシック" w:hAnsi="Arial" w:cs="Arial"/>
-          <w:b/>
-          <w:bCs/>
-          <w:kern w:val="0"/>
-          <w:sz w:val="27"/>
-          <w:szCs w:val="27"/>
-          <w14:ligatures w14:val="none"/>
-        </w:rPr>
-      </w:pPr>
-      <w:r>
-        <w:rPr>
-          <w:rFonts w:ascii="Arial" w:eastAsia="ＭＳ Ｐゴシック" w:hAnsi="Arial" w:cs="Arial"/>
-          <w:b/>
-          <w:bCs/>
-          <w:kern w:val="0"/>
-          <w:sz w:val="27"/>
-          <w:szCs w:val="27"/>
-          <w14:ligatures w14:val="none"/>
-        </w:rPr>
-        <w:t>7. Developer Warranties</w:t>
-      </w:r>
-    </w:p>
-    <w:p>
-      <w:pPr>
-        <w:widowControl/>
-        <w:spacing w:before="100" w:beforeAutospacing="1" w:after="100" w:afterAutospacing="1" w:line="240" w:lineRule="auto"/>
-        <w:rPr>
-          <w:rFonts w:ascii="Arial" w:eastAsia="ＭＳ Ｐゴシック" w:hAnsi="Arial" w:cs="Arial"/>
-          <w:kern w:val="0"/>
-          <w:sz w:val="24"/>
-          <w14:ligatures w14:val="none"/>
-        </w:rPr>
-      </w:pPr>
-      <w:r>
-        <w:rPr>
-          <w:rFonts w:ascii="Arial" w:eastAsia="ＭＳ Ｐゴシック" w:hAnsi="Arial" w:cs="Arial"/>
-          <w:kern w:val="0"/>
-          <w:sz w:val="24"/>
-          <w14:ligatures w14:val="none"/>
-        </w:rPr>
-        <w:t>The Developer represents and warrants that:</w:t>
-      </w:r>
-    </w:p>
-    <w:p>
-      <w:pPr>
-        <w:widowControl/>
-        <w:numPr>
-          <w:ilvl w:val="0"/>
-          <w:numId w:val="3"/>
-        </w:numPr>
-        <w:spacing w:before="100" w:beforeAutospacing="1" w:after="100" w:afterAutospacing="1" w:line="240" w:lineRule="auto"/>
-        <w:rPr>
-          <w:rFonts w:ascii="Arial" w:eastAsia="ＭＳ Ｐゴシック" w:hAnsi="Arial" w:cs="Arial"/>
-          <w:kern w:val="0"/>
-          <w:sz w:val="24"/>
-          <w14:ligatures w14:val="none"/>
-        </w:rPr>
-      </w:pPr>
-      <w:r>
-        <w:rPr>
-          <w:rFonts w:ascii="Arial" w:eastAsia="ＭＳ Ｐゴシック" w:hAnsi="Arial" w:cs="Arial"/>
-          <w:kern w:val="0"/>
-          <w:sz w:val="24"/>
-          <w14:ligatures w14:val="none"/>
-        </w:rPr>
-        <w:t>No existing contract prohibits the Developer from entering into this agreement.</w:t>
-      </w:r>
-    </w:p>
-    <w:p>
-      <w:pPr>
-        <w:widowControl/>
-        <w:numPr>
-          <w:ilvl w:val="0"/>
-          <w:numId w:val="3"/>
-        </w:numPr>
-        <w:spacing w:before="100" w:beforeAutospacing="1" w:after="100" w:afterAutospacing="1" w:line="240" w:lineRule="auto"/>
-        <w:rPr>
-          <w:rFonts w:ascii="Arial" w:eastAsia="ＭＳ Ｐゴシック" w:hAnsi="Arial" w:cs="Arial"/>
-          <w:kern w:val="0"/>
-          <w:sz w:val="24"/>
-          <w14:ligatures w14:val="none"/>
-        </w:rPr>
-      </w:pPr>
-      <w:r>
-        <w:rPr>
-          <w:rFonts w:ascii="Arial" w:eastAsia="ＭＳ Ｐゴシック" w:hAnsi="Arial" w:cs="Arial"/>
-          <w:kern w:val="0"/>
-          <w:sz w:val="24"/>
-          <w14:ligatures w14:val="none"/>
-        </w:rPr>
-        <w:t>The Software will not infringe on any third-party intellectual property rights.</w:t>
-      </w:r>
-    </w:p>
-    <w:p>
-      <w:pPr>
-        <w:widowControl/>
-        <w:numPr>
-          <w:ilvl w:val="0"/>
-          <w:numId w:val="3"/>
-        </w:numPr>
-        <w:spacing w:before="100" w:beforeAutospacing="1" w:after="100" w:afterAutospacing="1" w:line="240" w:lineRule="auto"/>
-        <w:rPr>
-          <w:rFonts w:ascii="Arial" w:eastAsia="ＭＳ Ｐゴシック" w:hAnsi="Arial" w:cs="Arial"/>
-          <w:kern w:val="0"/>
-          <w:sz w:val="24"/>
-          <w14:ligatures w14:val="none"/>
-        </w:rPr>
-      </w:pPr>
-      <w:r>
-        <w:rPr>
-          <w:rFonts w:ascii="Arial" w:eastAsia="ＭＳ Ｐゴシック" w:hAnsi="Arial" w:cs="Arial"/>
-          <w:kern w:val="0"/>
-          <w:sz w:val="24"/>
-          <w14:ligatures w14:val="none"/>
-        </w:rPr>
-        <w:t xml:space="preserve">The Software will operate according to the Specifications for </w:t>
-      </w:r>
-      <w:r>
-        <w:rPr>
-          <w:rFonts w:ascii="Arial" w:eastAsia="ＭＳ Ｐゴシック" w:hAnsi="Arial" w:cs="Arial"/>
-          <w:b/>
-          <w:bCs/>
-          <w:color w:val="EE0000"/>
-          <w:kern w:val="0"/>
-          <w:sz w:val="24"/>
-          <w14:ligatures w14:val="none"/>
-        </w:rPr>
-        <w:t>180 days</w:t>
-      </w:r>
-      <w:r>
-        <w:rPr>
-          <w:rFonts w:ascii="Arial" w:eastAsia="ＭＳ Ｐゴシック" w:hAnsi="Arial" w:cs="Arial"/>
-          <w:color w:val="EE0000"/>
-          <w:kern w:val="0"/>
-          <w:sz w:val="24"/>
-          <w14:ligatures w14:val="none"/>
-        </w:rPr>
-        <w:t xml:space="preserve"> </w:t>
-      </w:r>
-      <w:r>
-        <w:rPr>
-          <w:rFonts w:ascii="Arial" w:eastAsia="ＭＳ Ｐゴシック" w:hAnsi="Arial" w:cs="Arial"/>
-          <w:kern w:val="0"/>
-          <w:sz w:val="24"/>
-          <w14:ligatures w14:val="none"/>
-        </w:rPr>
-        <w:t>after delivery. Any malfunction during that time will be remedied at no extra cost.</w:t>
-      </w:r>
-    </w:p>
-    <w:p>
-      <w:pPr>
-        <w:widowControl/>
-        <w:spacing w:before="100" w:beforeAutospacing="1" w:after="100" w:afterAutospacing="1" w:line="240" w:lineRule="auto"/>
-        <w:outlineLvl w:val="2"/>
-        <w:rPr>
-          <w:rFonts w:ascii="Arial" w:eastAsia="ＭＳ Ｐゴシック" w:hAnsi="Arial" w:cs="Arial"/>
-          <w:b/>
-          <w:bCs/>
-          <w:kern w:val="0"/>
-          <w:sz w:val="27"/>
-          <w:szCs w:val="27"/>
-          <w14:ligatures w14:val="none"/>
-        </w:rPr>
-      </w:pPr>
-      <w:r>
-        <w:rPr>
-          <w:rFonts w:ascii="Arial" w:eastAsia="ＭＳ Ｐゴシック" w:hAnsi="Arial" w:cs="Arial"/>
-          <w:b/>
-          <w:bCs/>
-          <w:kern w:val="0"/>
-          <w:sz w:val="27"/>
-          <w:szCs w:val="27"/>
-          <w14:ligatures w14:val="none"/>
-        </w:rPr>
-        <w:t>8. Indemnification</w:t>
-      </w:r>
-    </w:p>
-    <w:p>
-      <w:pPr>
-        <w:widowControl/>
-        <w:spacing w:before="100" w:beforeAutospacing="1" w:after="100" w:afterAutospacing="1" w:line="240" w:lineRule="auto"/>
-        <w:rPr>
-          <w:rFonts w:ascii="Arial" w:eastAsia="ＭＳ Ｐゴシック" w:hAnsi="Arial" w:cs="Arial"/>
-          <w:kern w:val="0"/>
-          <w:sz w:val="24"/>
-          <w14:ligatures w14:val="none"/>
-        </w:rPr>
-      </w:pPr>
-      <w:r>
-        <w:rPr>
-          <w:rFonts w:ascii="Arial" w:eastAsia="ＭＳ Ｐゴシック" w:hAnsi="Arial" w:cs="Arial"/>
-          <w:kern w:val="0"/>
-          <w:sz w:val="24"/>
-          <w14:ligatures w14:val="none"/>
-        </w:rPr>
-        <w:t>The Developer agrees to indemnify and defend the Client against any claims, including legal fees, arising from intellectual property infringement or breach of warranty.</w:t>
-      </w:r>
-    </w:p>
-    <w:p>
-      <w:pPr>
-        <w:widowControl/>
-        <w:spacing w:before="100" w:beforeAutospacing="1" w:after="100" w:afterAutospacing="1" w:line="240" w:lineRule="auto"/>
-        <w:outlineLvl w:val="2"/>
-        <w:rPr>
-          <w:rFonts w:ascii="Arial" w:eastAsia="ＭＳ Ｐゴシック" w:hAnsi="Arial" w:cs="Arial"/>
-          <w:b/>
-          <w:bCs/>
-          <w:kern w:val="0"/>
-          <w:sz w:val="27"/>
-          <w:szCs w:val="27"/>
-          <w14:ligatures w14:val="none"/>
-        </w:rPr>
-      </w:pPr>
-      <w:r>
-        <w:rPr>
-          <w:rFonts w:ascii="Arial" w:eastAsia="ＭＳ Ｐゴシック" w:hAnsi="Arial" w:cs="Arial"/>
-          <w:b/>
-          <w:bCs/>
-          <w:kern w:val="0"/>
-          <w:sz w:val="27"/>
-          <w:szCs w:val="27"/>
-          <w14:ligatures w14:val="none"/>
-        </w:rPr>
-        <w:t>9. Modification</w:t>
-      </w:r>
-    </w:p>
-    <w:p>
-      <w:pPr>
-        <w:widowControl/>
-        <w:spacing w:before="100" w:beforeAutospacing="1" w:after="100" w:afterAutospacing="1" w:line="240" w:lineRule="auto"/>
-        <w:rPr>
-          <w:rFonts w:ascii="Arial" w:eastAsia="ＭＳ Ｐゴシック" w:hAnsi="Arial" w:cs="Arial"/>
-          <w:kern w:val="0"/>
-          <w:sz w:val="24"/>
-          <w14:ligatures w14:val="none"/>
-        </w:rPr>
-      </w:pPr>
-      <w:r>
-        <w:rPr>
-          <w:rFonts w:ascii="Arial" w:eastAsia="ＭＳ Ｐゴシック" w:hAnsi="Arial" w:cs="Arial"/>
-          <w:kern w:val="0"/>
-          <w:sz w:val="24"/>
-          <w14:ligatures w14:val="none"/>
-        </w:rPr>
-        <w:t>No modification of this Agreement shall be valid unless in writing and signed by both Parties.</w:t>
-      </w:r>
-    </w:p>
-    <w:p>
-      <w:pPr>
-        <w:widowControl/>
-        <w:spacing w:before="100" w:beforeAutospacing="1" w:after="100" w:afterAutospacing="1" w:line="240" w:lineRule="auto"/>
-        <w:outlineLvl w:val="2"/>
-        <w:rPr>
-          <w:rFonts w:ascii="Arial" w:eastAsia="ＭＳ Ｐゴシック" w:hAnsi="Arial" w:cs="Arial"/>
-          <w:b/>
-          <w:bCs/>
-          <w:kern w:val="0"/>
-          <w:sz w:val="27"/>
-          <w:szCs w:val="27"/>
-          <w14:ligatures w14:val="none"/>
-        </w:rPr>
-      </w:pPr>
-      <w:r>
-        <w:rPr>
-          <w:rFonts w:ascii="Arial" w:eastAsia="ＭＳ Ｐゴシック" w:hAnsi="Arial" w:cs="Arial"/>
-          <w:b/>
-          <w:bCs/>
-          <w:kern w:val="0"/>
-          <w:sz w:val="27"/>
-          <w:szCs w:val="27"/>
-          <w14:ligatures w14:val="none"/>
-        </w:rPr>
-        <w:t>10. Governing Law</w:t>
-      </w:r>
-    </w:p>
-    <w:p>
-      <w:pPr>
-        <w:widowControl/>
-        <w:autoSpaceDE w:val="0"/>
-        <w:autoSpaceDN w:val="0"/>
-        <w:adjustRightInd w:val="0"/>
-        <w:spacing w:after="240" w:line="340" w:lineRule="atLeast"/>
-        <w:rPr>
-          <w:rFonts w:ascii="Times Roman" w:hAnsi="Times Roman" w:cs="Times Roman"/>
-          <w:color w:val="000000"/>
-          <w:kern w:val="0"/>
-        </w:rPr>
-      </w:pPr>
-      <w:r>
-        <w:rPr>
-          <w:rFonts w:ascii="Arial" w:hAnsi="Arial" w:cs="Arial"/>
-          <w:color w:val="000000"/>
-          <w:kern w:val="0"/>
-          <w:sz w:val="24"/>
-        </w:rPr>
-        <w:t>This Software Development Agreement and the interpretation of its terms shall be governed by and construed in accordance with the laws of the</w:t>
-      </w:r>
-      <w:r>
-        <w:rPr>
-          <w:rFonts w:ascii="Arial" w:hAnsi="Arial" w:cs="Arial"/>
-          <w:color w:val="000000"/>
-          <w:kern w:val="0"/>
-          <w:sz w:val="24"/>
-        </w:rPr>
-        <w:t xml:space="preserve"> </w:t>
-      </w:r>
-      <w:r>
-        <w:rPr>
-          <w:rFonts w:ascii="Arial" w:hAnsi="Arial" w:cs="Arial"/>
-          <w:color w:val="EE0000"/>
-          <w:sz w:val="24"/>
-        </w:rPr>
-        <w:t>Japan (Tokyo)</w:t>
-      </w:r>
-      <w:r>
-        <w:rPr>
-          <w:rFonts w:ascii="Arial" w:hAnsi="Arial" w:cs="Arial"/>
-          <w:color w:val="EE0000"/>
-          <w:kern w:val="0"/>
-          <w:sz w:val="24"/>
-        </w:rPr>
-        <w:t xml:space="preserve"> </w:t>
-      </w:r>
-      <w:r>
-        <w:rPr>
-          <w:rFonts w:ascii="Arial" w:hAnsi="Arial" w:cs="Arial"/>
-          <w:color w:val="000000"/>
-          <w:kern w:val="0"/>
-          <w:sz w:val="24"/>
-        </w:rPr>
-        <w:t xml:space="preserve">and subject to the exclusive jurisdiction of the federal and state courts located in </w:t>
-      </w:r>
-      <w:proofErr w:type="spellStart"/>
-      <w:proofErr w:type="gramStart"/>
-      <w:r>
-        <w:rPr>
-          <w:rFonts w:ascii="Arial" w:hAnsi="Arial" w:cs="Arial"/>
-          <w:color w:val="FF0000"/>
-          <w:kern w:val="0"/>
-          <w:sz w:val="24"/>
-        </w:rPr>
-        <w:t>Japan,Tokyo</w:t>
-      </w:r>
-      <w:proofErr w:type="spellEnd"/>
-      <w:proofErr w:type="gramEnd"/>
-      <w:r>
-        <w:rPr>
-          <w:rFonts w:ascii="Arial" w:hAnsi="Arial" w:cs="Arial"/>
-          <w:color w:val="000000"/>
-          <w:kern w:val="0"/>
-          <w:sz w:val="24"/>
-        </w:rPr>
-        <w:t>.</w:t>
-      </w:r>
-      <w:r>
-        <w:rPr>
-          <w:rFonts w:ascii="Arial" w:hAnsi="Arial" w:cs="Arial"/>
-          <w:color w:val="000000"/>
-          <w:kern w:val="0"/>
-          <w:sz w:val="29"/>
-          <w:szCs w:val="29"/>
-        </w:rPr>
-        <w:t xml:space="preserve"> </w:t>
-      </w:r>
-    </w:p>
-    <w:p>
-      <w:pPr>
-        <w:widowControl/>
-        <w:spacing w:before="100" w:beforeAutospacing="1" w:after="100" w:afterAutospacing="1" w:line="240" w:lineRule="auto"/>
-        <w:outlineLvl w:val="2"/>
-        <w:rPr>
-          <w:rFonts w:ascii="Arial" w:eastAsia="ＭＳ Ｐゴシック" w:hAnsi="Arial" w:cs="Arial"/>
-          <w:b/>
-          <w:bCs/>
-          <w:kern w:val="0"/>
-          <w:sz w:val="27"/>
-          <w:szCs w:val="27"/>
-          <w14:ligatures w14:val="none"/>
-        </w:rPr>
-      </w:pPr>
-    </w:p>
-    <w:p>
-      <w:pPr>
-        <w:widowControl/>
-        <w:spacing w:before="100" w:beforeAutospacing="1" w:after="100" w:afterAutospacing="1" w:line="240" w:lineRule="auto"/>
-        <w:outlineLvl w:val="2"/>
-        <w:rPr>
-          <w:rFonts w:ascii="Arial" w:eastAsia="ＭＳ Ｐゴシック" w:hAnsi="Arial" w:cs="Arial"/>
-          <w:b/>
-          <w:bCs/>
-          <w:kern w:val="0"/>
-          <w:sz w:val="27"/>
-          <w:szCs w:val="27"/>
-          <w14:ligatures w14:val="none"/>
-        </w:rPr>
-      </w:pPr>
-    </w:p>
-    <w:p>
-      <w:pPr>
-        <w:widowControl/>
-        <w:spacing w:before="100" w:beforeAutospacing="1" w:after="100" w:afterAutospacing="1" w:line="240" w:lineRule="auto"/>
-        <w:outlineLvl w:val="2"/>
-        <w:rPr>
-          <w:rFonts w:ascii="Arial" w:eastAsia="ＭＳ Ｐゴシック" w:hAnsi="Arial" w:cs="Arial"/>
-          <w:b/>
-          <w:bCs/>
-          <w:kern w:val="0"/>
-          <w:sz w:val="27"/>
-          <w:szCs w:val="27"/>
-          <w14:ligatures w14:val="none"/>
-        </w:rPr>
-      </w:pPr>
-    </w:p>
-    <w:p>
-      <w:pPr>
-        <w:widowControl/>
-        <w:spacing w:before="100" w:beforeAutospacing="1" w:after="100" w:afterAutospacing="1" w:line="240" w:lineRule="auto"/>
-        <w:outlineLvl w:val="2"/>
-        <w:rPr>
-          <w:rFonts w:ascii="Arial" w:eastAsia="ＭＳ Ｐゴシック" w:hAnsi="Arial" w:cs="Arial"/>
-          <w:b/>
-          <w:bCs/>
-          <w:kern w:val="0"/>
-          <w:sz w:val="27"/>
-          <w:szCs w:val="27"/>
-          <w14:ligatures w14:val="none"/>
-        </w:rPr>
-      </w:pPr>
-    </w:p>
-    <w:p>
-      <w:pPr>
-        <w:widowControl/>
-        <w:spacing w:before="100" w:beforeAutospacing="1" w:after="100" w:afterAutospacing="1" w:line="240" w:lineRule="auto"/>
-        <w:outlineLvl w:val="2"/>
-        <w:rPr>
-          <w:rFonts w:ascii="Arial" w:eastAsia="ＭＳ Ｐゴシック" w:hAnsi="Arial" w:cs="Arial"/>
-          <w:b/>
-          <w:bCs/>
-          <w:kern w:val="0"/>
-          <w:sz w:val="27"/>
-          <w:szCs w:val="27"/>
-          <w14:ligatures w14:val="none"/>
-        </w:rPr>
-      </w:pPr>
-    </w:p>
-    <w:p>
-      <w:pPr>
-        <w:widowControl/>
-        <w:spacing w:before="100" w:beforeAutospacing="1" w:after="100" w:afterAutospacing="1" w:line="240" w:lineRule="auto"/>
-        <w:outlineLvl w:val="2"/>
-        <w:rPr>
-          <w:rFonts w:ascii="Arial" w:eastAsia="ＭＳ Ｐゴシック" w:hAnsi="Arial" w:cs="Arial"/>
+          <w:rFonts w:ascii="Arial" w:eastAsia="ＭＳ Ｐゴシック" w:hAnsi="Arial" w:cs="Arial" w:hint="eastAsia"/>
           <w:b/>
           <w:bCs/>
           <w:kern w:val="0"/>
@@ -2523,7 +2826,37 @@
                 <w:sz w:val="24"/>
                 <w14:ligatures w14:val="none"/>
               </w:rPr>
-              <w:t>21-Jul-25</w:t>
+              <w:t>5</w:t>
+            </w:r>
+            <w:r>
+              <w:rPr>
+                <w:rFonts w:ascii="Arial" w:eastAsia="Yu Gothic" w:hAnsi="Arial" w:cs="Arial" w:hint="eastAsia"/>
+                <w:color w:val="000000"/>
+                <w:kern w:val="0"/>
+                <w:sz w:val="24"/>
+                <w14:ligatures w14:val="none"/>
+              </w:rPr>
+              <w:t>-</w:t>
+            </w:r>
+            <w:r>
+              <w:rPr>
+                <w:rFonts w:ascii="Arial" w:eastAsia="Yu Gothic" w:hAnsi="Arial" w:cs="Arial" w:hint="eastAsia"/>
+                <w:color w:val="000000"/>
+                <w:kern w:val="0"/>
+                <w:sz w:val="24"/>
+                <w14:ligatures w14:val="none"/>
+              </w:rPr>
+              <w:t>Aug</w:t>
+            </w:r>
+            <w:r>
+              <w:rPr>
+                <w:rFonts w:ascii="Arial" w:eastAsia="Yu Gothic" w:hAnsi="Arial" w:cs="Arial"/>
+                <w:color w:val="000000"/>
+                <w:kern w:val="0"/>
+                <w:sz w:val="24"/>
+                <w14:ligatures w14:val="none"/>
+              </w:rPr>
+              <w:t>-25</w:t>
             </w:r>
           </w:p>
         </w:tc>
@@ -3290,6 +3623,124 @@
           </w:p>
         </w:tc>
       </w:tr>
+      <w:tr>
+        <w:trPr>
+          <w:trHeight w:val="400"/>
+        </w:trPr>
+        <w:tc>
+          <w:tcPr>
+            <w:tcW w:w="1500" w:type="dxa"/>
+            <w:tcBorders>
+              <w:top w:val="single" w:sz="4" w:space="0" w:color="auto"/>
+              <w:left w:val="single" w:sz="4" w:space="0" w:color="auto"/>
+              <w:bottom w:val="single" w:sz="4" w:space="0" w:color="auto"/>
+              <w:right w:val="single" w:sz="4" w:space="0" w:color="auto"/>
+            </w:tcBorders>
+            <w:shd w:val="clear" w:color="auto" w:fill="auto"/>
+            <w:vAlign w:val="center"/>
+          </w:tcPr>
+          <w:p>
+            <w:pPr>
+              <w:widowControl/>
+              <w:spacing w:after="0" w:line="240" w:lineRule="auto"/>
+              <w:jc w:val="center"/>
+              <w:rPr>
+                <w:rFonts w:ascii="Arial" w:eastAsia="Yu Gothic" w:hAnsi="Arial" w:cs="Arial"/>
+                <w:color w:val="000000"/>
+                <w:kern w:val="0"/>
+                <w:sz w:val="24"/>
+                <w14:ligatures w14:val="none"/>
+              </w:rPr>
+            </w:pPr>
+            <w:r>
+              <w:rPr>
+                <w:rFonts w:ascii="Arial" w:eastAsia="Yu Gothic" w:hAnsi="Arial" w:cs="Arial"/>
+                <w:color w:val="000000"/>
+                <w:kern w:val="0"/>
+                <w:sz w:val="24"/>
+                <w14:ligatures w14:val="none"/>
+              </w:rPr>
+              <w:t>Total</w:t>
+            </w:r>
+          </w:p>
+        </w:tc>
+        <w:tc>
+          <w:tcPr>
+            <w:tcW w:w="3720" w:type="dxa"/>
+            <w:tcBorders>
+              <w:top w:val="single" w:sz="4" w:space="0" w:color="auto"/>
+              <w:left w:val="nil"/>
+              <w:bottom w:val="single" w:sz="4" w:space="0" w:color="auto"/>
+              <w:right w:val="single" w:sz="4" w:space="0" w:color="auto"/>
+            </w:tcBorders>
+            <w:shd w:val="clear" w:color="auto" w:fill="auto"/>
+            <w:noWrap/>
+            <w:vAlign w:val="center"/>
+          </w:tcPr>
+          <w:p>
+            <w:pPr>
+              <w:widowControl/>
+              <w:spacing w:after="0" w:line="240" w:lineRule="auto"/>
+              <w:jc w:val="center"/>
+              <w:rPr>
+                <w:rFonts w:ascii="Arial" w:eastAsia="Yu Gothic" w:hAnsi="Arial" w:cs="Arial"/>
+                <w:color w:val="000000"/>
+                <w:kern w:val="0"/>
+                <w:sz w:val="24"/>
+                <w14:ligatures w14:val="none"/>
+              </w:rPr>
+            </w:pPr>
+            <w:r>
+              <w:rPr>
+                <w:rFonts w:ascii="Arial" w:eastAsia="Yu Gothic" w:hAnsi="Arial" w:cs="Arial"/>
+                <w:color w:val="000000"/>
+                <w:kern w:val="0"/>
+                <w:sz w:val="24"/>
+                <w14:ligatures w14:val="none"/>
+              </w:rPr>
+              <w:t>-</w:t>
+            </w:r>
+          </w:p>
+        </w:tc>
+        <w:tc>
+          <w:tcPr>
+            <w:tcW w:w="5140" w:type="dxa"/>
+            <w:tcBorders>
+              <w:top w:val="single" w:sz="4" w:space="0" w:color="auto"/>
+              <w:left w:val="nil"/>
+              <w:bottom w:val="single" w:sz="4" w:space="0" w:color="auto"/>
+              <w:right w:val="single" w:sz="4" w:space="0" w:color="auto"/>
+            </w:tcBorders>
+            <w:shd w:val="clear" w:color="auto" w:fill="auto"/>
+            <w:noWrap/>
+            <w:vAlign w:val="center"/>
+          </w:tcPr>
+          <w:p>
+            <w:pPr>
+              <w:widowControl/>
+              <w:spacing w:after="0" w:line="240" w:lineRule="auto"/>
+              <w:jc w:val="center"/>
+              <w:rPr>
+                <w:rFonts w:ascii="Arial" w:eastAsia="Yu Gothic" w:hAnsi="Arial" w:cs="Arial"/>
+                <w:color w:val="000000"/>
+                <w:kern w:val="0"/>
+                <w:sz w:val="24"/>
+                <w14:ligatures w14:val="none"/>
+              </w:rPr>
+            </w:pPr>
+            <w:r>
+              <w:rPr>
+                <w:rFonts w:ascii="Arial" w:eastAsia="Yu Gothic" w:hAnsi="Arial" w:cs="Arial"/>
+                <w:color w:val="000000"/>
+                <w:kern w:val="0"/>
+                <w:sz w:val="24"/>
+                <w14:ligatures w14:val="none"/>
+              </w:rPr>
+              <w:t>JPY 33,120,000</w:t>
+            </w:r>
+          </w:p>
+        </w:tc>
+      </w:tr>
     </w:tbl>
     <w:p>
       <w:pPr>
@@ -3302,6 +3753,27 @@
           <w14:ligatures w14:val="none"/>
         </w:rPr>
       </w:pPr>
+      <w:r>
+        <w:rPr>
+          <w:rFonts w:ascii="Arial" w:eastAsia="ＭＳ Ｐゴシック" w:hAnsi="Arial" w:cs="Arial"/>
+          <w:kern w:val="0"/>
+          <w:sz w:val="24"/>
+          <w14:ligatures w14:val="none"/>
+        </w:rPr>
+        <w:t>Note: Function categories (a) through (e) are detailed below</w:t>
+      </w:r>
+    </w:p>
+    <w:p>
+      <w:pPr>
+        <w:widowControl/>
+        <w:spacing w:beforeAutospacing="1" w:after="0" w:afterAutospacing="1" w:line="240" w:lineRule="auto"/>
+        <w:rPr>
+          <w:rFonts w:ascii="Arial" w:eastAsia="ＭＳ Ｐゴシック" w:hAnsi="Arial" w:cs="Arial"/>
+          <w:kern w:val="0"/>
+          <w:sz w:val="24"/>
+          <w14:ligatures w14:val="none"/>
+        </w:rPr>
+      </w:pPr>
     </w:p>
     <w:p>
       <w:pPr>
@@ -3309,7 +3781,7 @@
         <w:spacing w:before="100" w:beforeAutospacing="1" w:after="100" w:afterAutospacing="1" w:line="240" w:lineRule="auto"/>
         <w:outlineLvl w:val="2"/>
         <w:rPr>
-          <w:rFonts w:ascii="Arial" w:eastAsia="ＭＳ Ｐゴシック" w:hAnsi="Arial" w:cs="Arial" w:hint="eastAsia"/>
+          <w:rFonts w:ascii="Arial" w:eastAsia="ＭＳ Ｐゴシック" w:hAnsi="Arial" w:cs="Arial"/>
           <w:b/>
           <w:bCs/>
           <w:kern w:val="0"/>
@@ -3586,6 +4058,453 @@
     </w:lvl>
   </w:abstractNum>
   <w:abstractNum w:abstractNumId="1" w15:restartNumberingAfterBreak="0">
+    <w:nsid w:val="071E3ADE"/>
+    <w:multiLevelType w:val="multilevel"/>
+    <w:tmpl w:val="3ADEB384"/>
+    <w:lvl w:ilvl="0">
+      <w:start w:val="1"/>
+      <w:numFmt w:val="bullet"/>
+      <w:lvlText w:val=""/>
+      <w:lvlJc w:val="left"/>
+      <w:pPr>
+        <w:tabs>
+          <w:tab w:val="num" w:pos="720"/>
+        </w:tabs>
+        <w:ind w:left="720" w:hanging="360"/>
+      </w:pPr>
+      <w:rPr>
+        <w:rFonts w:ascii="Symbol" w:hAnsi="Symbol" w:hint="default"/>
+        <w:sz w:val="20"/>
+      </w:rPr>
+    </w:lvl>
+    <w:lvl w:ilvl="1" w:tentative="1">
+      <w:start w:val="1"/>
+      <w:numFmt w:val="bullet"/>
+      <w:lvlText w:val="o"/>
+      <w:lvlJc w:val="left"/>
+      <w:pPr>
+        <w:tabs>
+          <w:tab w:val="num" w:pos="1440"/>
+        </w:tabs>
+        <w:ind w:left="1440" w:hanging="360"/>
+      </w:pPr>
+      <w:rPr>
+        <w:rFonts w:ascii="Courier New" w:hAnsi="Courier New" w:hint="default"/>
+        <w:sz w:val="20"/>
+      </w:rPr>
+    </w:lvl>
+    <w:lvl w:ilvl="2" w:tentative="1">
+      <w:start w:val="1"/>
+      <w:numFmt w:val="bullet"/>
+      <w:lvlText w:val=""/>
+      <w:lvlJc w:val="left"/>
+      <w:pPr>
+        <w:tabs>
+          <w:tab w:val="num" w:pos="2160"/>
+        </w:tabs>
+        <w:ind w:left="2160" w:hanging="360"/>
+      </w:pPr>
+      <w:rPr>
+        <w:rFonts w:ascii="Wingdings" w:hAnsi="Wingdings" w:hint="default"/>
+        <w:sz w:val="20"/>
+      </w:rPr>
+    </w:lvl>
+    <w:lvl w:ilvl="3" w:tentative="1">
+      <w:start w:val="1"/>
+      <w:numFmt w:val="bullet"/>
+      <w:lvlText w:val=""/>
+      <w:lvlJc w:val="left"/>
+      <w:pPr>
+        <w:tabs>
+          <w:tab w:val="num" w:pos="2880"/>
+        </w:tabs>
+        <w:ind w:left="2880" w:hanging="360"/>
+      </w:pPr>
+      <w:rPr>
+        <w:rFonts w:ascii="Wingdings" w:hAnsi="Wingdings" w:hint="default"/>
+        <w:sz w:val="20"/>
+      </w:rPr>
+    </w:lvl>
+    <w:lvl w:ilvl="4" w:tentative="1">
+      <w:start w:val="1"/>
+      <w:numFmt w:val="bullet"/>
+      <w:lvlText w:val=""/>
+      <w:lvlJc w:val="left"/>
+      <w:pPr>
+        <w:tabs>
+          <w:tab w:val="num" w:pos="3600"/>
+        </w:tabs>
+        <w:ind w:left="3600" w:hanging="360"/>
+      </w:pPr>
+      <w:rPr>
+        <w:rFonts w:ascii="Wingdings" w:hAnsi="Wingdings" w:hint="default"/>
+        <w:sz w:val="20"/>
+      </w:rPr>
+    </w:lvl>
+    <w:lvl w:ilvl="5" w:tentative="1">
+      <w:start w:val="1"/>
+      <w:numFmt w:val="bullet"/>
+      <w:lvlText w:val=""/>
+      <w:lvlJc w:val="left"/>
+      <w:pPr>
+        <w:tabs>
+          <w:tab w:val="num" w:pos="4320"/>
+        </w:tabs>
+        <w:ind w:left="4320" w:hanging="360"/>
+      </w:pPr>
+      <w:rPr>
+        <w:rFonts w:ascii="Wingdings" w:hAnsi="Wingdings" w:hint="default"/>
+        <w:sz w:val="20"/>
+      </w:rPr>
+    </w:lvl>
+    <w:lvl w:ilvl="6" w:tentative="1">
+      <w:start w:val="1"/>
+      <w:numFmt w:val="bullet"/>
+      <w:lvlText w:val=""/>
+      <w:lvlJc w:val="left"/>
+      <w:pPr>
+        <w:tabs>
+          <w:tab w:val="num" w:pos="5040"/>
+        </w:tabs>
+        <w:ind w:left="5040" w:hanging="360"/>
+      </w:pPr>
+      <w:rPr>
+        <w:rFonts w:ascii="Wingdings" w:hAnsi="Wingdings" w:hint="default"/>
+        <w:sz w:val="20"/>
+      </w:rPr>
+    </w:lvl>
+    <w:lvl w:ilvl="7" w:tentative="1">
+      <w:start w:val="1"/>
+      <w:numFmt w:val="bullet"/>
+      <w:lvlText w:val=""/>
+      <w:lvlJc w:val="left"/>
+      <w:pPr>
+        <w:tabs>
+          <w:tab w:val="num" w:pos="5760"/>
+        </w:tabs>
+        <w:ind w:left="5760" w:hanging="360"/>
+      </w:pPr>
+      <w:rPr>
+        <w:rFonts w:ascii="Wingdings" w:hAnsi="Wingdings" w:hint="default"/>
+        <w:sz w:val="20"/>
+      </w:rPr>
+    </w:lvl>
+    <w:lvl w:ilvl="8" w:tentative="1">
+      <w:start w:val="1"/>
+      <w:numFmt w:val="bullet"/>
+      <w:lvlText w:val=""/>
+      <w:lvlJc w:val="left"/>
+      <w:pPr>
+        <w:tabs>
+          <w:tab w:val="num" w:pos="6480"/>
+        </w:tabs>
+        <w:ind w:left="6480" w:hanging="360"/>
+      </w:pPr>
+      <w:rPr>
+        <w:rFonts w:ascii="Wingdings" w:hAnsi="Wingdings" w:hint="default"/>
+        <w:sz w:val="20"/>
+      </w:rPr>
+    </w:lvl>
+  </w:abstractNum>
+  <w:abstractNum w:abstractNumId="2" w15:restartNumberingAfterBreak="0">
+    <w:nsid w:val="23A77122"/>
+    <w:multiLevelType w:val="multilevel"/>
+    <w:tmpl w:val="D818BDFE"/>
+    <w:lvl w:ilvl="0">
+      <w:start w:val="1"/>
+      <w:numFmt w:val="bullet"/>
+      <w:lvlText w:val=""/>
+      <w:lvlJc w:val="left"/>
+      <w:pPr>
+        <w:tabs>
+          <w:tab w:val="num" w:pos="720"/>
+        </w:tabs>
+        <w:ind w:left="720" w:hanging="360"/>
+      </w:pPr>
+      <w:rPr>
+        <w:rFonts w:ascii="Symbol" w:hAnsi="Symbol" w:hint="default"/>
+        <w:sz w:val="20"/>
+      </w:rPr>
+    </w:lvl>
+    <w:lvl w:ilvl="1" w:tentative="1">
+      <w:start w:val="1"/>
+      <w:numFmt w:val="bullet"/>
+      <w:lvlText w:val="o"/>
+      <w:lvlJc w:val="left"/>
+      <w:pPr>
+        <w:tabs>
+          <w:tab w:val="num" w:pos="1440"/>
+        </w:tabs>
+        <w:ind w:left="1440" w:hanging="360"/>
+      </w:pPr>
+      <w:rPr>
+        <w:rFonts w:ascii="Courier New" w:hAnsi="Courier New" w:hint="default"/>
+        <w:sz w:val="20"/>
+      </w:rPr>
+    </w:lvl>
+    <w:lvl w:ilvl="2" w:tentative="1">
+      <w:start w:val="1"/>
+      <w:numFmt w:val="bullet"/>
+      <w:lvlText w:val=""/>
+      <w:lvlJc w:val="left"/>
+      <w:pPr>
+        <w:tabs>
+          <w:tab w:val="num" w:pos="2160"/>
+        </w:tabs>
+        <w:ind w:left="2160" w:hanging="360"/>
+      </w:pPr>
+      <w:rPr>
+        <w:rFonts w:ascii="Wingdings" w:hAnsi="Wingdings" w:hint="default"/>
+        <w:sz w:val="20"/>
+      </w:rPr>
+    </w:lvl>
+    <w:lvl w:ilvl="3" w:tentative="1">
+      <w:start w:val="1"/>
+      <w:numFmt w:val="bullet"/>
+      <w:lvlText w:val=""/>
+      <w:lvlJc w:val="left"/>
+      <w:pPr>
+        <w:tabs>
+          <w:tab w:val="num" w:pos="2880"/>
+        </w:tabs>
+        <w:ind w:left="2880" w:hanging="360"/>
+      </w:pPr>
+      <w:rPr>
+        <w:rFonts w:ascii="Wingdings" w:hAnsi="Wingdings" w:hint="default"/>
+        <w:sz w:val="20"/>
+      </w:rPr>
+    </w:lvl>
+    <w:lvl w:ilvl="4" w:tentative="1">
+      <w:start w:val="1"/>
+      <w:numFmt w:val="bullet"/>
+      <w:lvlText w:val=""/>
+      <w:lvlJc w:val="left"/>
+      <w:pPr>
+        <w:tabs>
+          <w:tab w:val="num" w:pos="3600"/>
+        </w:tabs>
+        <w:ind w:left="3600" w:hanging="360"/>
+      </w:pPr>
+      <w:rPr>
+        <w:rFonts w:ascii="Wingdings" w:hAnsi="Wingdings" w:hint="default"/>
+        <w:sz w:val="20"/>
+      </w:rPr>
+    </w:lvl>
+    <w:lvl w:ilvl="5" w:tentative="1">
+      <w:start w:val="1"/>
+      <w:numFmt w:val="bullet"/>
+      <w:lvlText w:val=""/>
+      <w:lvlJc w:val="left"/>
+      <w:pPr>
+        <w:tabs>
+          <w:tab w:val="num" w:pos="4320"/>
+        </w:tabs>
+        <w:ind w:left="4320" w:hanging="360"/>
+      </w:pPr>
+      <w:rPr>
+        <w:rFonts w:ascii="Wingdings" w:hAnsi="Wingdings" w:hint="default"/>
+        <w:sz w:val="20"/>
+      </w:rPr>
+    </w:lvl>
+    <w:lvl w:ilvl="6" w:tentative="1">
+      <w:start w:val="1"/>
+      <w:numFmt w:val="bullet"/>
+      <w:lvlText w:val=""/>
+      <w:lvlJc w:val="left"/>
+      <w:pPr>
+        <w:tabs>
+          <w:tab w:val="num" w:pos="5040"/>
+        </w:tabs>
+        <w:ind w:left="5040" w:hanging="360"/>
+      </w:pPr>
+      <w:rPr>
+        <w:rFonts w:ascii="Wingdings" w:hAnsi="Wingdings" w:hint="default"/>
+        <w:sz w:val="20"/>
+      </w:rPr>
+    </w:lvl>
+    <w:lvl w:ilvl="7" w:tentative="1">
+      <w:start w:val="1"/>
+      <w:numFmt w:val="bullet"/>
+      <w:lvlText w:val=""/>
+      <w:lvlJc w:val="left"/>
+      <w:pPr>
+        <w:tabs>
+          <w:tab w:val="num" w:pos="5760"/>
+        </w:tabs>
+        <w:ind w:left="5760" w:hanging="360"/>
+      </w:pPr>
+      <w:rPr>
+        <w:rFonts w:ascii="Wingdings" w:hAnsi="Wingdings" w:hint="default"/>
+        <w:sz w:val="20"/>
+      </w:rPr>
+    </w:lvl>
+    <w:lvl w:ilvl="8" w:tentative="1">
+      <w:start w:val="1"/>
+      <w:numFmt w:val="bullet"/>
+      <w:lvlText w:val=""/>
+      <w:lvlJc w:val="left"/>
+      <w:pPr>
+        <w:tabs>
+          <w:tab w:val="num" w:pos="6480"/>
+        </w:tabs>
+        <w:ind w:left="6480" w:hanging="360"/>
+      </w:pPr>
+      <w:rPr>
+        <w:rFonts w:ascii="Wingdings" w:hAnsi="Wingdings" w:hint="default"/>
+        <w:sz w:val="20"/>
+      </w:rPr>
+    </w:lvl>
+  </w:abstractNum>
+  <w:abstractNum w:abstractNumId="3" w15:restartNumberingAfterBreak="0">
+    <w:nsid w:val="3ABC6C65"/>
+    <w:multiLevelType w:val="multilevel"/>
+    <w:tmpl w:val="34E8FFFA"/>
+    <w:lvl w:ilvl="0">
+      <w:start w:val="1"/>
+      <w:numFmt w:val="bullet"/>
+      <w:lvlText w:val=""/>
+      <w:lvlJc w:val="left"/>
+      <w:pPr>
+        <w:tabs>
+          <w:tab w:val="num" w:pos="720"/>
+        </w:tabs>
+        <w:ind w:left="720" w:hanging="360"/>
+      </w:pPr>
+      <w:rPr>
+        <w:rFonts w:ascii="Symbol" w:hAnsi="Symbol" w:hint="default"/>
+        <w:sz w:val="20"/>
+      </w:rPr>
+    </w:lvl>
+    <w:lvl w:ilvl="1">
+      <w:start w:val="1"/>
+      <w:numFmt w:val="bullet"/>
+      <w:lvlText w:val="o"/>
+      <w:lvlJc w:val="left"/>
+      <w:pPr>
+        <w:tabs>
+          <w:tab w:val="num" w:pos="1440"/>
+        </w:tabs>
+        <w:ind w:left="1440" w:hanging="360"/>
+      </w:pPr>
+      <w:rPr>
+        <w:rFonts w:ascii="Courier New" w:hAnsi="Courier New" w:hint="default"/>
+        <w:sz w:val="20"/>
+      </w:rPr>
+    </w:lvl>
+    <w:lvl w:ilvl="2" w:tentative="1">
+      <w:start w:val="1"/>
+      <w:numFmt w:val="bullet"/>
+      <w:lvlText w:val=""/>
+      <w:lvlJc w:val="left"/>
+      <w:pPr>
+        <w:tabs>
+          <w:tab w:val="num" w:pos="2160"/>
+        </w:tabs>
+        <w:ind w:left="2160" w:hanging="360"/>
+      </w:pPr>
+      <w:rPr>
+        <w:rFonts w:ascii="Wingdings" w:hAnsi="Wingdings" w:hint="default"/>
+        <w:sz w:val="20"/>
+      </w:rPr>
+    </w:lvl>
+    <w:lvl w:ilvl="3" w:tentative="1">
+      <w:start w:val="1"/>
+      <w:numFmt w:val="bullet"/>
+      <w:lvlText w:val=""/>
+      <w:lvlJc w:val="left"/>
+      <w:pPr>
+        <w:tabs>
+          <w:tab w:val="num" w:pos="2880"/>
+        </w:tabs>
+        <w:ind w:left="2880" w:hanging="360"/>
+      </w:pPr>
+      <w:rPr>
+        <w:rFonts w:ascii="Wingdings" w:hAnsi="Wingdings" w:hint="default"/>
+        <w:sz w:val="20"/>
+      </w:rPr>
+    </w:lvl>
+    <w:lvl w:ilvl="4" w:tentative="1">
+      <w:start w:val="1"/>
+      <w:numFmt w:val="bullet"/>
+      <w:lvlText w:val=""/>
+      <w:lvlJc w:val="left"/>
+      <w:pPr>
+        <w:tabs>
+          <w:tab w:val="num" w:pos="3600"/>
+        </w:tabs>
+        <w:ind w:left="3600" w:hanging="360"/>
+      </w:pPr>
+      <w:rPr>
+        <w:rFonts w:ascii="Wingdings" w:hAnsi="Wingdings" w:hint="default"/>
+        <w:sz w:val="20"/>
+      </w:rPr>
+    </w:lvl>
+    <w:lvl w:ilvl="5" w:tentative="1">
+      <w:start w:val="1"/>
+      <w:numFmt w:val="bullet"/>
+      <w:lvlText w:val=""/>
+      <w:lvlJc w:val="left"/>
+      <w:pPr>
+        <w:tabs>
+          <w:tab w:val="num" w:pos="4320"/>
+        </w:tabs>
+        <w:ind w:left="4320" w:hanging="360"/>
+      </w:pPr>
+      <w:rPr>
+        <w:rFonts w:ascii="Wingdings" w:hAnsi="Wingdings" w:hint="default"/>
+        <w:sz w:val="20"/>
+      </w:rPr>
+    </w:lvl>
+    <w:lvl w:ilvl="6" w:tentative="1">
+      <w:start w:val="1"/>
+      <w:numFmt w:val="bullet"/>
+      <w:lvlText w:val=""/>
+      <w:lvlJc w:val="left"/>
+      <w:pPr>
+        <w:tabs>
+          <w:tab w:val="num" w:pos="5040"/>
+        </w:tabs>
+        <w:ind w:left="5040" w:hanging="360"/>
+      </w:pPr>
+      <w:rPr>
+        <w:rFonts w:ascii="Wingdings" w:hAnsi="Wingdings" w:hint="default"/>
+        <w:sz w:val="20"/>
+      </w:rPr>
+    </w:lvl>
+    <w:lvl w:ilvl="7" w:tentative="1">
+      <w:start w:val="1"/>
+      <w:numFmt w:val="bullet"/>
+      <w:lvlText w:val=""/>
+      <w:lvlJc w:val="left"/>
+      <w:pPr>
+        <w:tabs>
+          <w:tab w:val="num" w:pos="5760"/>
+        </w:tabs>
+        <w:ind w:left="5760" w:hanging="360"/>
+      </w:pPr>
+      <w:rPr>
+        <w:rFonts w:ascii="Wingdings" w:hAnsi="Wingdings" w:hint="default"/>
+        <w:sz w:val="20"/>
+      </w:rPr>
+    </w:lvl>
+    <w:lvl w:ilvl="8" w:tentative="1">
+      <w:start w:val="1"/>
+      <w:numFmt w:val="bullet"/>
+      <w:lvlText w:val=""/>
+      <w:lvlJc w:val="left"/>
+      <w:pPr>
+        <w:tabs>
+          <w:tab w:val="num" w:pos="6480"/>
+        </w:tabs>
+        <w:ind w:left="6480" w:hanging="360"/>
+      </w:pPr>
+      <w:rPr>
+        <w:rFonts w:ascii="Wingdings" w:hAnsi="Wingdings" w:hint="default"/>
+        <w:sz w:val="20"/>
+      </w:rPr>
+    </w:lvl>
+  </w:abstractNum>
+  <w:abstractNum w:abstractNumId="4" w15:restartNumberingAfterBreak="0">
     <w:nsid w:val="3AF21CB8"/>
     <w:multiLevelType w:val="multilevel"/>
     <w:tmpl w:val="C7021EEA"/>
@@ -3698,7 +4617,7 @@
       </w:pPr>
     </w:lvl>
   </w:abstractNum>
-  <w:abstractNum w:abstractNumId="2" w15:restartNumberingAfterBreak="0">
+  <w:abstractNum w:abstractNumId="5" w15:restartNumberingAfterBreak="0">
     <w:nsid w:val="484C4D34"/>
     <w:multiLevelType w:val="multilevel"/>
     <w:tmpl w:val="1354DD6A"/>
@@ -3847,7 +4766,305 @@
       </w:rPr>
     </w:lvl>
   </w:abstractNum>
-  <w:abstractNum w:abstractNumId="3" w15:restartNumberingAfterBreak="0">
+  <w:abstractNum w:abstractNumId="6" w15:restartNumberingAfterBreak="0">
+    <w:nsid w:val="606665E4"/>
+    <w:multiLevelType w:val="multilevel"/>
+    <w:tmpl w:val="4CA489BA"/>
+    <w:lvl w:ilvl="0">
+      <w:start w:val="1"/>
+      <w:numFmt w:val="bullet"/>
+      <w:lvlText w:val=""/>
+      <w:lvlJc w:val="left"/>
+      <w:pPr>
+        <w:tabs>
+          <w:tab w:val="num" w:pos="720"/>
+        </w:tabs>
+        <w:ind w:left="720" w:hanging="360"/>
+      </w:pPr>
+      <w:rPr>
+        <w:rFonts w:ascii="Symbol" w:hAnsi="Symbol" w:hint="default"/>
+        <w:sz w:val="20"/>
+      </w:rPr>
+    </w:lvl>
+    <w:lvl w:ilvl="1" w:tentative="1">
+      <w:start w:val="1"/>
+      <w:numFmt w:val="bullet"/>
+      <w:lvlText w:val="o"/>
+      <w:lvlJc w:val="left"/>
+      <w:pPr>
+        <w:tabs>
+          <w:tab w:val="num" w:pos="1440"/>
+        </w:tabs>
+        <w:ind w:left="1440" w:hanging="360"/>
+      </w:pPr>
+      <w:rPr>
+        <w:rFonts w:ascii="Courier New" w:hAnsi="Courier New" w:hint="default"/>
+        <w:sz w:val="20"/>
+      </w:rPr>
+    </w:lvl>
+    <w:lvl w:ilvl="2" w:tentative="1">
+      <w:start w:val="1"/>
+      <w:numFmt w:val="bullet"/>
+      <w:lvlText w:val=""/>
+      <w:lvlJc w:val="left"/>
+      <w:pPr>
+        <w:tabs>
+          <w:tab w:val="num" w:pos="2160"/>
+        </w:tabs>
+        <w:ind w:left="2160" w:hanging="360"/>
+      </w:pPr>
+      <w:rPr>
+        <w:rFonts w:ascii="Wingdings" w:hAnsi="Wingdings" w:hint="default"/>
+        <w:sz w:val="20"/>
+      </w:rPr>
+    </w:lvl>
+    <w:lvl w:ilvl="3" w:tentative="1">
+      <w:start w:val="1"/>
+      <w:numFmt w:val="bullet"/>
+      <w:lvlText w:val=""/>
+      <w:lvlJc w:val="left"/>
+      <w:pPr>
+        <w:tabs>
+          <w:tab w:val="num" w:pos="2880"/>
+        </w:tabs>
+        <w:ind w:left="2880" w:hanging="360"/>
+      </w:pPr>
+      <w:rPr>
+        <w:rFonts w:ascii="Wingdings" w:hAnsi="Wingdings" w:hint="default"/>
+        <w:sz w:val="20"/>
+      </w:rPr>
+    </w:lvl>
+    <w:lvl w:ilvl="4" w:tentative="1">
+      <w:start w:val="1"/>
+      <w:numFmt w:val="bullet"/>
+      <w:lvlText w:val=""/>
+      <w:lvlJc w:val="left"/>
+      <w:pPr>
+        <w:tabs>
+          <w:tab w:val="num" w:pos="3600"/>
+        </w:tabs>
+        <w:ind w:left="3600" w:hanging="360"/>
+      </w:pPr>
+      <w:rPr>
+        <w:rFonts w:ascii="Wingdings" w:hAnsi="Wingdings" w:hint="default"/>
+        <w:sz w:val="20"/>
+      </w:rPr>
+    </w:lvl>
+    <w:lvl w:ilvl="5" w:tentative="1">
+      <w:start w:val="1"/>
+      <w:numFmt w:val="bullet"/>
+      <w:lvlText w:val=""/>
+      <w:lvlJc w:val="left"/>
+      <w:pPr>
+        <w:tabs>
+          <w:tab w:val="num" w:pos="4320"/>
+        </w:tabs>
+        <w:ind w:left="4320" w:hanging="360"/>
+      </w:pPr>
+      <w:rPr>
+        <w:rFonts w:ascii="Wingdings" w:hAnsi="Wingdings" w:hint="default"/>
+        <w:sz w:val="20"/>
+      </w:rPr>
+    </w:lvl>
+    <w:lvl w:ilvl="6" w:tentative="1">
+      <w:start w:val="1"/>
+      <w:numFmt w:val="bullet"/>
+      <w:lvlText w:val=""/>
+      <w:lvlJc w:val="left"/>
+      <w:pPr>
+        <w:tabs>
+          <w:tab w:val="num" w:pos="5040"/>
+        </w:tabs>
+        <w:ind w:left="5040" w:hanging="360"/>
+      </w:pPr>
+      <w:rPr>
+        <w:rFonts w:ascii="Wingdings" w:hAnsi="Wingdings" w:hint="default"/>
+        <w:sz w:val="20"/>
+      </w:rPr>
+    </w:lvl>
+    <w:lvl w:ilvl="7" w:tentative="1">
+      <w:start w:val="1"/>
+      <w:numFmt w:val="bullet"/>
+      <w:lvlText w:val=""/>
+      <w:lvlJc w:val="left"/>
+      <w:pPr>
+        <w:tabs>
+          <w:tab w:val="num" w:pos="5760"/>
+        </w:tabs>
+        <w:ind w:left="5760" w:hanging="360"/>
+      </w:pPr>
+      <w:rPr>
+        <w:rFonts w:ascii="Wingdings" w:hAnsi="Wingdings" w:hint="default"/>
+        <w:sz w:val="20"/>
+      </w:rPr>
+    </w:lvl>
+    <w:lvl w:ilvl="8" w:tentative="1">
+      <w:start w:val="1"/>
+      <w:numFmt w:val="bullet"/>
+      <w:lvlText w:val=""/>
+      <w:lvlJc w:val="left"/>
+      <w:pPr>
+        <w:tabs>
+          <w:tab w:val="num" w:pos="6480"/>
+        </w:tabs>
+        <w:ind w:left="6480" w:hanging="360"/>
+      </w:pPr>
+      <w:rPr>
+        <w:rFonts w:ascii="Wingdings" w:hAnsi="Wingdings" w:hint="default"/>
+        <w:sz w:val="20"/>
+      </w:rPr>
+    </w:lvl>
+  </w:abstractNum>
+  <w:abstractNum w:abstractNumId="7" w15:restartNumberingAfterBreak="0">
+    <w:nsid w:val="708204D4"/>
+    <w:multiLevelType w:val="multilevel"/>
+    <w:tmpl w:val="BEBE278C"/>
+    <w:lvl w:ilvl="0">
+      <w:start w:val="1"/>
+      <w:numFmt w:val="bullet"/>
+      <w:lvlText w:val=""/>
+      <w:lvlJc w:val="left"/>
+      <w:pPr>
+        <w:tabs>
+          <w:tab w:val="num" w:pos="720"/>
+        </w:tabs>
+        <w:ind w:left="720" w:hanging="360"/>
+      </w:pPr>
+      <w:rPr>
+        <w:rFonts w:ascii="Symbol" w:hAnsi="Symbol" w:hint="default"/>
+        <w:sz w:val="20"/>
+      </w:rPr>
+    </w:lvl>
+    <w:lvl w:ilvl="1">
+      <w:start w:val="1"/>
+      <w:numFmt w:val="bullet"/>
+      <w:lvlText w:val="o"/>
+      <w:lvlJc w:val="left"/>
+      <w:pPr>
+        <w:tabs>
+          <w:tab w:val="num" w:pos="1440"/>
+        </w:tabs>
+        <w:ind w:left="1440" w:hanging="360"/>
+      </w:pPr>
+      <w:rPr>
+        <w:rFonts w:ascii="Courier New" w:hAnsi="Courier New" w:hint="default"/>
+        <w:sz w:val="20"/>
+      </w:rPr>
+    </w:lvl>
+    <w:lvl w:ilvl="2" w:tentative="1">
+      <w:start w:val="1"/>
+      <w:numFmt w:val="bullet"/>
+      <w:lvlText w:val=""/>
+      <w:lvlJc w:val="left"/>
+      <w:pPr>
+        <w:tabs>
+          <w:tab w:val="num" w:pos="2160"/>
+        </w:tabs>
+        <w:ind w:left="2160" w:hanging="360"/>
+      </w:pPr>
+      <w:rPr>
+        <w:rFonts w:ascii="Wingdings" w:hAnsi="Wingdings" w:hint="default"/>
+        <w:sz w:val="20"/>
+      </w:rPr>
+    </w:lvl>
+    <w:lvl w:ilvl="3" w:tentative="1">
+      <w:start w:val="1"/>
+      <w:numFmt w:val="bullet"/>
+      <w:lvlText w:val=""/>
+      <w:lvlJc w:val="left"/>
+      <w:pPr>
+        <w:tabs>
+          <w:tab w:val="num" w:pos="2880"/>
+        </w:tabs>
+        <w:ind w:left="2880" w:hanging="360"/>
+      </w:pPr>
+      <w:rPr>
+        <w:rFonts w:ascii="Wingdings" w:hAnsi="Wingdings" w:hint="default"/>
+        <w:sz w:val="20"/>
+      </w:rPr>
+    </w:lvl>
+    <w:lvl w:ilvl="4" w:tentative="1">
+      <w:start w:val="1"/>
+      <w:numFmt w:val="bullet"/>
+      <w:lvlText w:val=""/>
+      <w:lvlJc w:val="left"/>
+      <w:pPr>
+        <w:tabs>
+          <w:tab w:val="num" w:pos="3600"/>
+        </w:tabs>
+        <w:ind w:left="3600" w:hanging="360"/>
+      </w:pPr>
+      <w:rPr>
+        <w:rFonts w:ascii="Wingdings" w:hAnsi="Wingdings" w:hint="default"/>
+        <w:sz w:val="20"/>
+      </w:rPr>
+    </w:lvl>
+    <w:lvl w:ilvl="5" w:tentative="1">
+      <w:start w:val="1"/>
+      <w:numFmt w:val="bullet"/>
+      <w:lvlText w:val=""/>
+      <w:lvlJc w:val="left"/>
+      <w:pPr>
+        <w:tabs>
+          <w:tab w:val="num" w:pos="4320"/>
+        </w:tabs>
+        <w:ind w:left="4320" w:hanging="360"/>
+      </w:pPr>
+      <w:rPr>
+        <w:rFonts w:ascii="Wingdings" w:hAnsi="Wingdings" w:hint="default"/>
+        <w:sz w:val="20"/>
+      </w:rPr>
+    </w:lvl>
+    <w:lvl w:ilvl="6" w:tentative="1">
+      <w:start w:val="1"/>
+      <w:numFmt w:val="bullet"/>
+      <w:lvlText w:val=""/>
+      <w:lvlJc w:val="left"/>
+      <w:pPr>
+        <w:tabs>
+          <w:tab w:val="num" w:pos="5040"/>
+        </w:tabs>
+        <w:ind w:left="5040" w:hanging="360"/>
+      </w:pPr>
+      <w:rPr>
+        <w:rFonts w:ascii="Wingdings" w:hAnsi="Wingdings" w:hint="default"/>
+        <w:sz w:val="20"/>
+      </w:rPr>
+    </w:lvl>
+    <w:lvl w:ilvl="7" w:tentative="1">
+      <w:start w:val="1"/>
+      <w:numFmt w:val="bullet"/>
+      <w:lvlText w:val=""/>
+      <w:lvlJc w:val="left"/>
+      <w:pPr>
+        <w:tabs>
+          <w:tab w:val="num" w:pos="5760"/>
+        </w:tabs>
+        <w:ind w:left="5760" w:hanging="360"/>
+      </w:pPr>
+      <w:rPr>
+        <w:rFonts w:ascii="Wingdings" w:hAnsi="Wingdings" w:hint="default"/>
+        <w:sz w:val="20"/>
+      </w:rPr>
+    </w:lvl>
+    <w:lvl w:ilvl="8" w:tentative="1">
+      <w:start w:val="1"/>
+      <w:numFmt w:val="bullet"/>
+      <w:lvlText w:val=""/>
+      <w:lvlJc w:val="left"/>
+      <w:pPr>
+        <w:tabs>
+          <w:tab w:val="num" w:pos="6480"/>
+        </w:tabs>
+        <w:ind w:left="6480" w:hanging="360"/>
+      </w:pPr>
+      <w:rPr>
+        <w:rFonts w:ascii="Wingdings" w:hAnsi="Wingdings" w:hint="default"/>
+        <w:sz w:val="20"/>
+      </w:rPr>
+    </w:lvl>
+  </w:abstractNum>
+  <w:abstractNum w:abstractNumId="8" w15:restartNumberingAfterBreak="0">
     <w:nsid w:val="746929EF"/>
     <w:multiLevelType w:val="multilevel"/>
     <w:tmpl w:val="F2204D3C"/>
@@ -3960,17 +5177,184 @@
       </w:pPr>
     </w:lvl>
   </w:abstractNum>
+  <w:abstractNum w:abstractNumId="9" w15:restartNumberingAfterBreak="0">
+    <w:nsid w:val="7F0B258E"/>
+    <w:multiLevelType w:val="multilevel"/>
+    <w:tmpl w:val="C9B6CF98"/>
+    <w:lvl w:ilvl="0">
+      <w:start w:val="1"/>
+      <w:numFmt w:val="bullet"/>
+      <w:lvlText w:val=""/>
+      <w:lvlJc w:val="left"/>
+      <w:pPr>
+        <w:tabs>
+          <w:tab w:val="num" w:pos="720"/>
+        </w:tabs>
+        <w:ind w:left="720" w:hanging="360"/>
+      </w:pPr>
+      <w:rPr>
+        <w:rFonts w:ascii="Symbol" w:hAnsi="Symbol" w:hint="default"/>
+        <w:sz w:val="20"/>
+      </w:rPr>
+    </w:lvl>
+    <w:lvl w:ilvl="1" w:tentative="1">
+      <w:start w:val="1"/>
+      <w:numFmt w:val="bullet"/>
+      <w:lvlText w:val="o"/>
+      <w:lvlJc w:val="left"/>
+      <w:pPr>
+        <w:tabs>
+          <w:tab w:val="num" w:pos="1440"/>
+        </w:tabs>
+        <w:ind w:left="1440" w:hanging="360"/>
+      </w:pPr>
+      <w:rPr>
+        <w:rFonts w:ascii="Courier New" w:hAnsi="Courier New" w:hint="default"/>
+        <w:sz w:val="20"/>
+      </w:rPr>
+    </w:lvl>
+    <w:lvl w:ilvl="2" w:tentative="1">
+      <w:start w:val="1"/>
+      <w:numFmt w:val="bullet"/>
+      <w:lvlText w:val=""/>
+      <w:lvlJc w:val="left"/>
+      <w:pPr>
+        <w:tabs>
+          <w:tab w:val="num" w:pos="2160"/>
+        </w:tabs>
+        <w:ind w:left="2160" w:hanging="360"/>
+      </w:pPr>
+      <w:rPr>
+        <w:rFonts w:ascii="Wingdings" w:hAnsi="Wingdings" w:hint="default"/>
+        <w:sz w:val="20"/>
+      </w:rPr>
+    </w:lvl>
+    <w:lvl w:ilvl="3" w:tentative="1">
+      <w:start w:val="1"/>
+      <w:numFmt w:val="bullet"/>
+      <w:lvlText w:val=""/>
+      <w:lvlJc w:val="left"/>
+      <w:pPr>
+        <w:tabs>
+          <w:tab w:val="num" w:pos="2880"/>
+        </w:tabs>
+        <w:ind w:left="2880" w:hanging="360"/>
+      </w:pPr>
+      <w:rPr>
+        <w:rFonts w:ascii="Wingdings" w:hAnsi="Wingdings" w:hint="default"/>
+        <w:sz w:val="20"/>
+      </w:rPr>
+    </w:lvl>
+    <w:lvl w:ilvl="4" w:tentative="1">
+      <w:start w:val="1"/>
+      <w:numFmt w:val="bullet"/>
+      <w:lvlText w:val=""/>
+      <w:lvlJc w:val="left"/>
+      <w:pPr>
+        <w:tabs>
+          <w:tab w:val="num" w:pos="3600"/>
+        </w:tabs>
+        <w:ind w:left="3600" w:hanging="360"/>
+      </w:pPr>
+      <w:rPr>
+        <w:rFonts w:ascii="Wingdings" w:hAnsi="Wingdings" w:hint="default"/>
+        <w:sz w:val="20"/>
+      </w:rPr>
+    </w:lvl>
+    <w:lvl w:ilvl="5" w:tentative="1">
+      <w:start w:val="1"/>
+      <w:numFmt w:val="bullet"/>
+      <w:lvlText w:val=""/>
+      <w:lvlJc w:val="left"/>
+      <w:pPr>
+        <w:tabs>
+          <w:tab w:val="num" w:pos="4320"/>
+        </w:tabs>
+        <w:ind w:left="4320" w:hanging="360"/>
+      </w:pPr>
+      <w:rPr>
+        <w:rFonts w:ascii="Wingdings" w:hAnsi="Wingdings" w:hint="default"/>
+        <w:sz w:val="20"/>
+      </w:rPr>
+    </w:lvl>
+    <w:lvl w:ilvl="6" w:tentative="1">
+      <w:start w:val="1"/>
+      <w:numFmt w:val="bullet"/>
+      <w:lvlText w:val=""/>
+      <w:lvlJc w:val="left"/>
+      <w:pPr>
+        <w:tabs>
+          <w:tab w:val="num" w:pos="5040"/>
+        </w:tabs>
+        <w:ind w:left="5040" w:hanging="360"/>
+      </w:pPr>
+      <w:rPr>
+        <w:rFonts w:ascii="Wingdings" w:hAnsi="Wingdings" w:hint="default"/>
+        <w:sz w:val="20"/>
+      </w:rPr>
+    </w:lvl>
+    <w:lvl w:ilvl="7" w:tentative="1">
+      <w:start w:val="1"/>
+      <w:numFmt w:val="bullet"/>
+      <w:lvlText w:val=""/>
+      <w:lvlJc w:val="left"/>
+      <w:pPr>
+        <w:tabs>
+          <w:tab w:val="num" w:pos="5760"/>
+        </w:tabs>
+        <w:ind w:left="5760" w:hanging="360"/>
+      </w:pPr>
+      <w:rPr>
+        <w:rFonts w:ascii="Wingdings" w:hAnsi="Wingdings" w:hint="default"/>
+        <w:sz w:val="20"/>
+      </w:rPr>
+    </w:lvl>
+    <w:lvl w:ilvl="8" w:tentative="1">
+      <w:start w:val="1"/>
+      <w:numFmt w:val="bullet"/>
+      <w:lvlText w:val=""/>
+      <w:lvlJc w:val="left"/>
+      <w:pPr>
+        <w:tabs>
+          <w:tab w:val="num" w:pos="6480"/>
+        </w:tabs>
+        <w:ind w:left="6480" w:hanging="360"/>
+      </w:pPr>
+      <w:rPr>
+        <w:rFonts w:ascii="Wingdings" w:hAnsi="Wingdings" w:hint="default"/>
+        <w:sz w:val="20"/>
+      </w:rPr>
+    </w:lvl>
+  </w:abstractNum>
   <w:num w:numId="1" w16cid:durableId="516965633">
-    <w:abstractNumId w:val="1"/>
+    <w:abstractNumId w:val="4"/>
   </w:num>
   <w:num w:numId="2" w16cid:durableId="942614340">
-    <w:abstractNumId w:val="3"/>
+    <w:abstractNumId w:val="8"/>
   </w:num>
   <w:num w:numId="3" w16cid:durableId="3483660">
     <w:abstractNumId w:val="0"/>
   </w:num>
   <w:num w:numId="4" w16cid:durableId="1679039881">
+    <w:abstractNumId w:val="5"/>
+  </w:num>
+  <w:num w:numId="5" w16cid:durableId="226689297">
+    <w:abstractNumId w:val="6"/>
+  </w:num>
+  <w:num w:numId="6" w16cid:durableId="885332786">
+    <w:abstractNumId w:val="1"/>
+  </w:num>
+  <w:num w:numId="7" w16cid:durableId="992486532">
+    <w:abstractNumId w:val="9"/>
+  </w:num>
+  <w:num w:numId="8" w16cid:durableId="431126912">
     <w:abstractNumId w:val="2"/>
+  </w:num>
+  <w:num w:numId="9" w16cid:durableId="937716640">
+    <w:abstractNumId w:val="7"/>
+  </w:num>
+  <w:num w:numId="10" w16cid:durableId="1473064700">
+    <w:abstractNumId w:val="3"/>
   </w:num>
 </w:numbering>
 </file>
@@ -4406,7 +5790,6 @@
     <w:next w:val="a"/>
     <w:link w:val="20"/>
     <w:uiPriority w:val="9"/>
-    <w:semiHidden/>
     <w:unhideWhenUsed/>
     <w:qFormat/>
     <w:rsid w:val="006A5B8D"/>
@@ -4620,7 +6003,6 @@
     <w:basedOn w:val="a0"/>
     <w:link w:val="2"/>
     <w:uiPriority w:val="9"/>
-    <w:semiHidden/>
     <w:rsid w:val="006A5B8D"/>
     <w:rPr>
       <w:rFonts w:asciiTheme="majorHAnsi" w:eastAsiaTheme="majorEastAsia" w:hAnsiTheme="majorHAnsi" w:cstheme="majorBidi"/>

</xml_diff>